<commit_message>
fix: docx quittance (#56)
Co-authored-by: Christian COLEY <christian.coley@smile.com>
</commit_message>
<xml_diff>
--- a/src/assets/docx/Quittance_de_loyer.docx
+++ b/src/assets/docx/Quittance_de_loyer.docx
@@ -2,23 +2,7 @@
 <file path=word/document.xml><?xml version="1.0" encoding="utf-8"?>
 <w:document xmlns:o="urn:schemas-microsoft-com:office:office" xmlns:r="http://schemas.openxmlformats.org/officeDocument/2006/relationships" xmlns:v="urn:schemas-microsoft-com:vml" xmlns:w="http://schemas.openxmlformats.org/wordprocessingml/2006/main" xmlns:w10="urn:schemas-microsoft-com:office:word" xmlns:wp="http://schemas.openxmlformats.org/drawingml/2006/wordprocessingDrawing" xmlns:wps="http://schemas.microsoft.com/office/word/2010/wordprocessingShape" xmlns:wpg="http://schemas.microsoft.com/office/word/2010/wordprocessingGroup" xmlns:mc="http://schemas.openxmlformats.org/markup-compatibility/2006" xmlns:wp14="http://schemas.microsoft.com/office/word/2010/wordprocessingDrawing" xmlns:w14="http://schemas.microsoft.com/office/word/2010/wordml" xmlns:w15="http://schemas.microsoft.com/office/word/2012/wordml" xmlns:a="http://schemas.openxmlformats.org/drawingml/2006/main" xmlns:pic="http://schemas.openxmlformats.org/drawingml/2006/picture" mc:Ignorable="w14 wp14 w15">
   <w:body>
-    <w:p xmlns:wp14="http://schemas.microsoft.com/office/word/2010/wordml" wp14:textId="77777777">
-      <w:pPr>
-        <w:pStyle w:val="Normal"/>
-        <w:jc w:val="center"/>
-        <w:rPr>
-          <w:sz w:val="40"/>
-          <w:szCs w:val="40"/>
-        </w:rPr>
-      </w:pPr>
-      <w:r>
-        <w:rPr>
-          <w:sz w:val="40"/>
-          <w:szCs w:val="40"/>
-        </w:rPr>
-      </w:r>
-    </w:p>
-    <w:p xmlns:wp14="http://schemas.microsoft.com/office/word/2010/wordml" wp14:textId="77777777">
+    <w:p xmlns:wp14="http://schemas.microsoft.com/office/word/2010/wordml" wp14:textId="68FC43FD">
       <w:pPr>
         <w:pStyle w:val="Normal"/>
         <w:jc w:val="center"/>

</xml_diff>

<commit_message>
feat: docx signature quittance
</commit_message>
<xml_diff>
--- a/src/assets/docx/Quittance_de_loyer.docx
+++ b/src/assets/docx/Quittance_de_loyer.docx
@@ -1,8 +1,8 @@
 
 <file path=word/document.xml><?xml version="1.0" encoding="utf-8"?>
-<w:document xmlns:o="urn:schemas-microsoft-com:office:office" xmlns:r="http://schemas.openxmlformats.org/officeDocument/2006/relationships" xmlns:v="urn:schemas-microsoft-com:vml" xmlns:w="http://schemas.openxmlformats.org/wordprocessingml/2006/main" xmlns:w10="urn:schemas-microsoft-com:office:word" xmlns:wp="http://schemas.openxmlformats.org/drawingml/2006/wordprocessingDrawing" xmlns:wps="http://schemas.microsoft.com/office/word/2010/wordprocessingShape" xmlns:wpg="http://schemas.microsoft.com/office/word/2010/wordprocessingGroup" xmlns:mc="http://schemas.openxmlformats.org/markup-compatibility/2006" xmlns:wp14="http://schemas.microsoft.com/office/word/2010/wordprocessingDrawing" xmlns:w14="http://schemas.microsoft.com/office/word/2010/wordml" xmlns:w15="http://schemas.microsoft.com/office/word/2012/wordml" xmlns:a="http://schemas.openxmlformats.org/drawingml/2006/main" xmlns:pic="http://schemas.openxmlformats.org/drawingml/2006/picture" mc:Ignorable="w14 wp14 w15">
+<w:document xmlns:o="urn:schemas-microsoft-com:office:office" xmlns:r="http://schemas.openxmlformats.org/officeDocument/2006/relationships" xmlns:v="urn:schemas-microsoft-com:vml" xmlns:w="http://schemas.openxmlformats.org/wordprocessingml/2006/main" xmlns:w10="urn:schemas-microsoft-com:office:word" xmlns:wp="http://schemas.openxmlformats.org/drawingml/2006/wordprocessingDrawing" xmlns:wps="http://schemas.microsoft.com/office/word/2010/wordprocessingShape" xmlns:wpg="http://schemas.microsoft.com/office/word/2010/wordprocessingGroup" xmlns:mc="http://schemas.openxmlformats.org/markup-compatibility/2006" xmlns:wp14="http://schemas.microsoft.com/office/word/2010/wordprocessingDrawing" xmlns:w14="http://schemas.microsoft.com/office/word/2010/wordml" xmlns:w15="http://schemas.microsoft.com/office/word/2012/wordml" mc:Ignorable="w14 wp14 w15">
   <w:body>
-    <w:p xmlns:wp14="http://schemas.microsoft.com/office/word/2010/wordml" wp14:textId="68FC43FD">
+    <w:p>
       <w:pPr>
         <w:pStyle w:val="Normal"/>
         <w:jc w:val="center"/>
@@ -19,7 +19,7 @@
         <w:t>QUITTANCE DE LOYER</w:t>
       </w:r>
     </w:p>
-    <w:p xmlns:wp14="http://schemas.microsoft.com/office/word/2010/wordml" wp14:textId="77777777">
+    <w:p>
       <w:pPr>
         <w:pStyle w:val="Normal"/>
         <w:jc w:val="center"/>
@@ -33,40 +33,19 @@
           <w:sz w:val="24"/>
           <w:szCs w:val="24"/>
         </w:rPr>
-        <w:t xml:space="preserve">Période du </w:t>
-      </w:r>
-      <w:r>
-        <w:rPr>
-          <w:sz w:val="24"/>
-          <w:szCs w:val="24"/>
-        </w:rPr>
-        <w:t>{date_from}</w:t>
-      </w:r>
-      <w:r>
-        <w:rPr>
-          <w:sz w:val="24"/>
-          <w:szCs w:val="24"/>
-        </w:rPr>
-        <w:t xml:space="preserve"> au   </w:t>
-      </w:r>
-      <w:r>
-        <w:rPr>
-          <w:sz w:val="24"/>
-          <w:szCs w:val="24"/>
-        </w:rPr>
-        <w:t>{date_to}</w:t>
-      </w:r>
-    </w:p>
-    <w:p xmlns:wp14="http://schemas.microsoft.com/office/word/2010/wordml" wp14:textId="77777777">
-      <w:pPr>
-        <w:pStyle w:val="Normal"/>
-        <w:rPr/>
-      </w:pPr>
-      <w:r>
-        <w:rPr/>
-      </w:r>
-    </w:p>
-    <w:p xmlns:wp14="http://schemas.microsoft.com/office/word/2010/wordml" wp14:textId="77777777">
+        <w:t>Période du {date_from} au {date_to}</w:t>
+      </w:r>
+    </w:p>
+    <w:p>
+      <w:pPr>
+        <w:pStyle w:val="Normal"/>
+        <w:rPr/>
+      </w:pPr>
+      <w:r>
+        <w:rPr/>
+      </w:r>
+    </w:p>
+    <w:p>
       <w:pPr>
         <w:pStyle w:val="Normal"/>
         <w:rPr>
@@ -93,20 +72,20 @@
           <w:bottom w:w="0" w:type="dxa"/>
           <w:right w:w="108" w:type="dxa"/>
         </w:tblCellMar>
-        <w:tblLook w:val="0400" w:firstRow="0" w:lastRow="0" w:firstColumn="0" w:lastColumn="0" w:noHBand="0" w:noVBand="1"/>
+        <w:tblLook w:val="0400" w:noHBand="0" w:noVBand="1" w:firstColumn="0" w:lastRow="0" w:lastColumn="0" w:firstRow="0"/>
       </w:tblPr>
       <w:tblGrid>
         <w:gridCol w:w="5669"/>
         <w:gridCol w:w="3686"/>
       </w:tblGrid>
-      <w:tr xmlns:wp14="http://schemas.microsoft.com/office/word/2010/wordml" wp14:textId="77777777">
+      <w:tr>
         <w:trPr/>
         <w:tc>
           <w:tcPr>
             <w:tcW w:w="5669" w:type="dxa"/>
             <w:tcBorders/>
           </w:tcPr>
-          <w:p wp14:textId="77777777">
+          <w:p>
             <w:pPr>
               <w:pStyle w:val="Normal"/>
               <w:widowControl w:val="false"/>
@@ -123,7 +102,7 @@
               <w:t xml:space="preserve"> </w:t>
             </w:r>
           </w:p>
-          <w:p wp14:textId="77777777">
+          <w:p>
             <w:pPr>
               <w:pStyle w:val="Normal"/>
               <w:widowControl w:val="false"/>
@@ -133,7 +112,7 @@
               <w:rPr/>
             </w:r>
           </w:p>
-          <w:p wp14:textId="77777777">
+          <w:p>
             <w:pPr>
               <w:pStyle w:val="Normal"/>
               <w:widowControl w:val="false"/>
@@ -144,7 +123,7 @@
               <w:t xml:space="preserve">{nom_bailleur} {prenom_bailleur} </w:t>
             </w:r>
           </w:p>
-          <w:p wp14:textId="77777777">
+          <w:p>
             <w:pPr>
               <w:pStyle w:val="Normal"/>
               <w:widowControl w:val="false"/>
@@ -155,7 +134,7 @@
               <w:t>{adresse_bailleur}</w:t>
             </w:r>
           </w:p>
-          <w:p wp14:textId="77777777">
+          <w:p>
             <w:pPr>
               <w:pStyle w:val="Normal"/>
               <w:widowControl w:val="false"/>
@@ -166,7 +145,7 @@
               <w:t>{cp_ville_bailleur}</w:t>
             </w:r>
           </w:p>
-          <w:p wp14:textId="77777777">
+          <w:p>
             <w:pPr>
               <w:pStyle w:val="Normal"/>
               <w:widowControl w:val="false"/>
@@ -183,7 +162,7 @@
             <w:tcW w:w="3686" w:type="dxa"/>
             <w:tcBorders/>
           </w:tcPr>
-          <w:p wp14:textId="77777777">
+          <w:p>
             <w:pPr>
               <w:pStyle w:val="Normal"/>
               <w:widowControl w:val="false"/>
@@ -200,7 +179,7 @@
               <w:t>Locataire</w:t>
             </w:r>
           </w:p>
-          <w:p wp14:textId="77777777">
+          <w:p>
             <w:pPr>
               <w:pStyle w:val="Normal"/>
               <w:widowControl w:val="false"/>
@@ -216,7 +195,7 @@
               </w:rPr>
             </w:r>
           </w:p>
-          <w:p wp14:textId="77777777">
+          <w:p>
             <w:pPr>
               <w:pStyle w:val="Normal"/>
               <w:widowControl w:val="false"/>
@@ -228,7 +207,7 @@
               <w:t xml:space="preserve">{nom_locataire} {prenom_locataire} </w:t>
             </w:r>
           </w:p>
-          <w:p wp14:textId="77777777">
+          <w:p>
             <w:pPr>
               <w:pStyle w:val="Normal"/>
               <w:widowControl w:val="false"/>
@@ -240,7 +219,7 @@
               <w:t>{adresse_locataire}</w:t>
             </w:r>
           </w:p>
-          <w:p wp14:textId="77777777">
+          <w:p>
             <w:pPr>
               <w:pStyle w:val="Normal"/>
               <w:widowControl w:val="false"/>
@@ -259,30 +238,30 @@
         </w:tc>
       </w:tr>
     </w:tbl>
-    <w:p xmlns:wp14="http://schemas.microsoft.com/office/word/2010/wordml" wp14:textId="77777777">
-      <w:pPr>
-        <w:pStyle w:val="Normal"/>
-        <w:spacing w:before="0" w:after="0" w:line="240" w:lineRule="auto"/>
-        <w:rPr/>
-      </w:pPr>
-      <w:r>
-        <w:rPr/>
-      </w:r>
-    </w:p>
-    <w:p xmlns:wp14="http://schemas.microsoft.com/office/word/2010/wordml" wp14:textId="77777777">
-      <w:pPr>
-        <w:pStyle w:val="Normal"/>
-        <w:spacing w:before="0" w:after="0" w:line="240" w:lineRule="auto"/>
-        <w:rPr/>
-      </w:pPr>
-      <w:r>
-        <w:rPr/>
-      </w:r>
-    </w:p>
-    <w:p xmlns:wp14="http://schemas.microsoft.com/office/word/2010/wordml" wp14:textId="77777777">
-      <w:pPr>
-        <w:pStyle w:val="Normal"/>
-        <w:spacing w:before="0" w:after="0" w:line="240" w:lineRule="auto"/>
+    <w:p>
+      <w:pPr>
+        <w:pStyle w:val="Normal"/>
+        <w:spacing w:lineRule="auto" w:line="240" w:before="0" w:after="0"/>
+        <w:rPr/>
+      </w:pPr>
+      <w:r>
+        <w:rPr/>
+      </w:r>
+    </w:p>
+    <w:p>
+      <w:pPr>
+        <w:pStyle w:val="Normal"/>
+        <w:spacing w:lineRule="auto" w:line="240" w:before="0" w:after="0"/>
+        <w:rPr/>
+      </w:pPr>
+      <w:r>
+        <w:rPr/>
+      </w:r>
+    </w:p>
+    <w:p>
+      <w:pPr>
+        <w:pStyle w:val="Normal"/>
+        <w:spacing w:lineRule="auto" w:line="240" w:before="0" w:after="0"/>
         <w:jc w:val="right"/>
         <w:rPr/>
       </w:pPr>
@@ -291,10 +270,10 @@
         <w:t>Fait à {ville_signature}, le {date_now}</w:t>
       </w:r>
     </w:p>
-    <w:p xmlns:wp14="http://schemas.microsoft.com/office/word/2010/wordml" wp14:textId="77777777">
-      <w:pPr>
-        <w:pStyle w:val="Normal"/>
-        <w:spacing w:before="0" w:after="0" w:line="240" w:lineRule="auto"/>
+    <w:p>
+      <w:pPr>
+        <w:pStyle w:val="Normal"/>
+        <w:spacing w:lineRule="auto" w:line="240" w:before="0" w:after="0"/>
         <w:jc w:val="right"/>
         <w:rPr/>
       </w:pPr>
@@ -302,10 +281,10 @@
         <w:rPr/>
       </w:r>
     </w:p>
-    <w:p xmlns:wp14="http://schemas.microsoft.com/office/word/2010/wordml" wp14:textId="77777777">
-      <w:pPr>
-        <w:pStyle w:val="Normal"/>
-        <w:spacing w:before="0" w:after="0" w:line="240" w:lineRule="auto"/>
+    <w:p>
+      <w:pPr>
+        <w:pStyle w:val="Normal"/>
+        <w:spacing w:lineRule="auto" w:line="240" w:before="0" w:after="0"/>
         <w:jc w:val="right"/>
         <w:rPr/>
       </w:pPr>
@@ -313,10 +292,10 @@
         <w:rPr/>
       </w:r>
     </w:p>
-    <w:p xmlns:wp14="http://schemas.microsoft.com/office/word/2010/wordml" wp14:textId="77777777">
-      <w:pPr>
-        <w:pStyle w:val="Normal"/>
-        <w:spacing w:before="0" w:after="0" w:line="240" w:lineRule="auto"/>
+    <w:p>
+      <w:pPr>
+        <w:pStyle w:val="Normal"/>
+        <w:spacing w:lineRule="auto" w:line="240" w:before="0" w:after="0"/>
         <w:jc w:val="right"/>
         <w:rPr>
           <w:b/>
@@ -329,16 +308,16 @@
         </w:rPr>
       </w:r>
     </w:p>
-    <w:p xmlns:wp14="http://schemas.microsoft.com/office/word/2010/wordml" wp14:textId="77777777">
+    <w:p>
       <w:pPr>
         <w:pStyle w:val="Normal"/>
         <w:pBdr>
-          <w:top w:val="single" w:color="000000" w:sz="4" w:space="1"/>
-          <w:left w:val="single" w:color="000000" w:sz="4" w:space="4"/>
-          <w:bottom w:val="single" w:color="000000" w:sz="4" w:space="1"/>
-          <w:right w:val="single" w:color="000000" w:sz="4" w:space="4"/>
+          <w:top w:val="single" w:sz="4" w:space="1" w:color="000000"/>
+          <w:left w:val="single" w:sz="4" w:space="4" w:color="000000"/>
+          <w:bottom w:val="single" w:sz="4" w:space="1" w:color="000000"/>
+          <w:right w:val="single" w:sz="4" w:space="4" w:color="000000"/>
         </w:pBdr>
-        <w:spacing w:before="0" w:after="0" w:line="240" w:lineRule="auto"/>
+        <w:spacing w:lineRule="auto" w:line="240" w:before="0" w:after="0"/>
         <w:jc w:val="both"/>
         <w:rPr>
           <w:b/>
@@ -351,16 +330,16 @@
         </w:rPr>
       </w:r>
     </w:p>
-    <w:p xmlns:wp14="http://schemas.microsoft.com/office/word/2010/wordml" wp14:textId="77777777">
+    <w:p>
       <w:pPr>
         <w:pStyle w:val="Normal"/>
         <w:pBdr>
-          <w:top w:val="single" w:color="000000" w:sz="4" w:space="1"/>
-          <w:left w:val="single" w:color="000000" w:sz="4" w:space="4"/>
-          <w:bottom w:val="single" w:color="000000" w:sz="4" w:space="1"/>
-          <w:right w:val="single" w:color="000000" w:sz="4" w:space="4"/>
+          <w:top w:val="single" w:sz="4" w:space="1" w:color="000000"/>
+          <w:left w:val="single" w:sz="4" w:space="4" w:color="000000"/>
+          <w:bottom w:val="single" w:sz="4" w:space="1" w:color="000000"/>
+          <w:right w:val="single" w:sz="4" w:space="4" w:color="000000"/>
         </w:pBdr>
-        <w:spacing w:before="0" w:after="0" w:line="240" w:lineRule="auto"/>
+        <w:spacing w:lineRule="auto" w:line="240" w:before="0" w:after="0"/>
         <w:jc w:val="both"/>
         <w:rPr>
           <w:b/>
@@ -374,16 +353,16 @@
         <w:t>Adresse de la location :</w:t>
       </w:r>
     </w:p>
-    <w:p xmlns:wp14="http://schemas.microsoft.com/office/word/2010/wordml" wp14:textId="77777777">
+    <w:p>
       <w:pPr>
         <w:pStyle w:val="Normal"/>
         <w:pBdr>
-          <w:top w:val="single" w:color="000000" w:sz="4" w:space="1"/>
-          <w:left w:val="single" w:color="000000" w:sz="4" w:space="4"/>
-          <w:bottom w:val="single" w:color="000000" w:sz="4" w:space="1"/>
-          <w:right w:val="single" w:color="000000" w:sz="4" w:space="4"/>
+          <w:top w:val="single" w:sz="4" w:space="1" w:color="000000"/>
+          <w:left w:val="single" w:sz="4" w:space="4" w:color="000000"/>
+          <w:bottom w:val="single" w:sz="4" w:space="1" w:color="000000"/>
+          <w:right w:val="single" w:sz="4" w:space="4" w:color="000000"/>
         </w:pBdr>
-        <w:spacing w:before="0" w:after="0" w:line="240" w:lineRule="auto"/>
+        <w:spacing w:lineRule="auto" w:line="240" w:before="0" w:after="0"/>
         <w:jc w:val="both"/>
         <w:rPr>
           <w:b/>
@@ -396,16 +375,16 @@
         </w:rPr>
       </w:r>
     </w:p>
-    <w:p xmlns:wp14="http://schemas.microsoft.com/office/word/2010/wordml" wp14:textId="77777777">
+    <w:p>
       <w:pPr>
         <w:pStyle w:val="Normal"/>
         <w:pBdr>
-          <w:top w:val="single" w:color="000000" w:sz="4" w:space="1"/>
-          <w:left w:val="single" w:color="000000" w:sz="4" w:space="4"/>
-          <w:bottom w:val="single" w:color="000000" w:sz="4" w:space="1"/>
-          <w:right w:val="single" w:color="000000" w:sz="4" w:space="4"/>
+          <w:top w:val="single" w:sz="4" w:space="1" w:color="000000"/>
+          <w:left w:val="single" w:sz="4" w:space="4" w:color="000000"/>
+          <w:bottom w:val="single" w:sz="4" w:space="1" w:color="000000"/>
+          <w:right w:val="single" w:sz="4" w:space="4" w:color="000000"/>
         </w:pBdr>
-        <w:spacing w:before="0" w:after="0" w:line="240" w:lineRule="auto"/>
+        <w:spacing w:lineRule="auto" w:line="240" w:before="0" w:after="0"/>
         <w:jc w:val="both"/>
         <w:rPr/>
       </w:pPr>
@@ -414,16 +393,16 @@
         <w:t>{adresse_locataire}</w:t>
       </w:r>
     </w:p>
-    <w:p xmlns:wp14="http://schemas.microsoft.com/office/word/2010/wordml" wp14:textId="77777777">
+    <w:p>
       <w:pPr>
         <w:pStyle w:val="Normal"/>
         <w:pBdr>
-          <w:top w:val="single" w:color="000000" w:sz="4" w:space="1"/>
-          <w:left w:val="single" w:color="000000" w:sz="4" w:space="4"/>
-          <w:bottom w:val="single" w:color="000000" w:sz="4" w:space="1"/>
-          <w:right w:val="single" w:color="000000" w:sz="4" w:space="4"/>
+          <w:top w:val="single" w:sz="4" w:space="1" w:color="000000"/>
+          <w:left w:val="single" w:sz="4" w:space="4" w:color="000000"/>
+          <w:bottom w:val="single" w:sz="4" w:space="1" w:color="000000"/>
+          <w:right w:val="single" w:sz="4" w:space="4" w:color="000000"/>
         </w:pBdr>
-        <w:spacing w:before="0" w:after="0" w:line="240" w:lineRule="auto"/>
+        <w:spacing w:lineRule="auto" w:line="240" w:before="0" w:after="0"/>
         <w:jc w:val="both"/>
         <w:rPr/>
       </w:pPr>
@@ -432,16 +411,16 @@
         <w:t>{cp_ville_location}</w:t>
       </w:r>
     </w:p>
-    <w:p xmlns:wp14="http://schemas.microsoft.com/office/word/2010/wordml" wp14:textId="77777777">
+    <w:p>
       <w:pPr>
         <w:pStyle w:val="Normal"/>
         <w:pBdr>
-          <w:top w:val="single" w:color="000000" w:sz="4" w:space="1"/>
-          <w:left w:val="single" w:color="000000" w:sz="4" w:space="4"/>
-          <w:bottom w:val="single" w:color="000000" w:sz="4" w:space="1"/>
-          <w:right w:val="single" w:color="000000" w:sz="4" w:space="4"/>
+          <w:top w:val="single" w:sz="4" w:space="1" w:color="000000"/>
+          <w:left w:val="single" w:sz="4" w:space="4" w:color="000000"/>
+          <w:bottom w:val="single" w:sz="4" w:space="1" w:color="000000"/>
+          <w:right w:val="single" w:sz="4" w:space="4" w:color="000000"/>
         </w:pBdr>
-        <w:spacing w:before="0" w:after="0" w:line="240" w:lineRule="auto"/>
+        <w:spacing w:lineRule="auto" w:line="240" w:before="0" w:after="0"/>
         <w:jc w:val="both"/>
         <w:rPr/>
       </w:pPr>
@@ -449,16 +428,16 @@
         <w:rPr/>
       </w:r>
     </w:p>
-    <w:p xmlns:wp14="http://schemas.microsoft.com/office/word/2010/wordml" wp14:textId="77777777">
+    <w:p>
       <w:pPr>
         <w:pStyle w:val="Normal"/>
         <w:pBdr>
-          <w:top w:val="single" w:color="000000" w:sz="4" w:space="1"/>
-          <w:left w:val="single" w:color="000000" w:sz="4" w:space="4"/>
-          <w:bottom w:val="single" w:color="000000" w:sz="4" w:space="1"/>
-          <w:right w:val="single" w:color="000000" w:sz="4" w:space="4"/>
+          <w:top w:val="single" w:sz="4" w:space="1" w:color="000000"/>
+          <w:left w:val="single" w:sz="4" w:space="4" w:color="000000"/>
+          <w:bottom w:val="single" w:sz="4" w:space="1" w:color="000000"/>
+          <w:right w:val="single" w:sz="4" w:space="4" w:color="000000"/>
         </w:pBdr>
-        <w:spacing w:before="0" w:after="0" w:line="240" w:lineRule="auto"/>
+        <w:spacing w:lineRule="auto" w:line="240" w:before="0" w:after="0"/>
         <w:jc w:val="both"/>
         <w:rPr/>
       </w:pPr>
@@ -466,10 +445,10 @@
         <w:rPr/>
       </w:r>
     </w:p>
-    <w:p xmlns:wp14="http://schemas.microsoft.com/office/word/2010/wordml" wp14:textId="77777777">
-      <w:pPr>
-        <w:pStyle w:val="Normal"/>
-        <w:spacing w:before="0" w:after="0" w:line="240" w:lineRule="auto"/>
+    <w:p>
+      <w:pPr>
+        <w:pStyle w:val="Normal"/>
+        <w:spacing w:lineRule="auto" w:line="240" w:before="0" w:after="0"/>
         <w:jc w:val="both"/>
         <w:rPr/>
       </w:pPr>
@@ -477,10 +456,10 @@
         <w:rPr/>
       </w:r>
     </w:p>
-    <w:p xmlns:wp14="http://schemas.microsoft.com/office/word/2010/wordml" wp14:textId="77777777">
-      <w:pPr>
-        <w:pStyle w:val="Normal"/>
-        <w:spacing w:before="0" w:after="0" w:line="240" w:lineRule="auto"/>
+    <w:p>
+      <w:pPr>
+        <w:pStyle w:val="Normal"/>
+        <w:spacing w:lineRule="auto" w:line="240" w:before="0" w:after="0"/>
         <w:jc w:val="both"/>
         <w:rPr/>
       </w:pPr>
@@ -488,10 +467,10 @@
         <w:rPr/>
       </w:r>
     </w:p>
-    <w:p xmlns:wp14="http://schemas.microsoft.com/office/word/2010/wordml" wp14:textId="77777777">
-      <w:pPr>
-        <w:pStyle w:val="Normal"/>
-        <w:spacing w:before="0" w:after="0" w:line="240" w:lineRule="auto"/>
+    <w:p>
+      <w:pPr>
+        <w:pStyle w:val="Normal"/>
+        <w:spacing w:lineRule="auto" w:line="240" w:before="0" w:after="0"/>
         <w:jc w:val="both"/>
         <w:rPr/>
       </w:pPr>
@@ -511,13 +490,13 @@
           <w:bottom w:w="0" w:type="dxa"/>
           <w:right w:w="108" w:type="dxa"/>
         </w:tblCellMar>
-        <w:tblLook w:val="0100" w:firstRow="0" w:lastRow="0" w:firstColumn="0" w:lastColumn="1" w:noHBand="0" w:noVBand="0"/>
+        <w:tblLook w:val="0100" w:noHBand="0" w:noVBand="0" w:firstColumn="0" w:lastRow="0" w:lastColumn="1" w:firstRow="0"/>
       </w:tblPr>
       <w:tblGrid>
         <w:gridCol w:w="6996"/>
         <w:gridCol w:w="2526"/>
       </w:tblGrid>
-      <w:tr xmlns:wp14="http://schemas.microsoft.com/office/word/2010/wordml" wp14:textId="77777777">
+      <w:tr>
         <w:trPr>
           <w:trHeight w:val="567" w:hRule="atLeast"/>
         </w:trPr>
@@ -525,15 +504,14 @@
           <w:tcPr>
             <w:tcW w:w="6996" w:type="dxa"/>
             <w:tcBorders>
-              <w:top w:val="single" w:color="000000" w:themeColor="text1" w:sz="4" w:space="0"/>
-              <w:left w:val="single" w:color="000000" w:themeColor="text1" w:sz="4" w:space="0"/>
-              <w:bottom w:val="single" w:color="000000" w:themeColor="text1" w:sz="4" w:space="0"/>
-              <w:right w:val="single" w:color="000000" w:themeColor="text1" w:sz="4" w:space="0"/>
+              <w:top w:val="single" w:sz="4" w:space="0" w:color="000000"/>
+              <w:left w:val="single" w:sz="4" w:space="0" w:color="000000"/>
+              <w:bottom w:val="single" w:sz="4" w:space="0" w:color="000000"/>
+              <w:right w:val="single" w:sz="4" w:space="0" w:color="000000"/>
             </w:tcBorders>
-            <w:shd w:val="clear" w:color="auto" w:fill="BFBFBF" w:themeFill="background1" w:themeFillShade="BF"/>
-            <w:tcMar/>
+            <w:shd w:color="auto" w:fill="BFBFBF" w:themeFill="background1" w:themeFillShade="bf" w:val="clear"/>
           </w:tcPr>
-          <w:p wp14:textId="77777777">
+          <w:p>
             <w:pPr>
               <w:pStyle w:val="Normal"/>
               <w:widowControl w:val="false"/>
@@ -544,6 +522,17 @@
               </w:rPr>
             </w:pPr>
             <w:r>
+              <w:rPr/>
+            </w:r>
+          </w:p>
+          <w:p>
+            <w:pPr>
+              <w:pStyle w:val="Normal"/>
+              <w:widowControl w:val="false"/>
+              <w:spacing w:before="0" w:after="160"/>
+              <w:rPr/>
+            </w:pPr>
+            <w:r>
               <w:rPr>
                 <w:b/>
               </w:rPr>
@@ -555,15 +544,14 @@
           <w:tcPr>
             <w:tcW w:w="2526" w:type="dxa"/>
             <w:tcBorders>
-              <w:top w:val="single" w:color="000000" w:themeColor="text1" w:sz="4" w:space="0"/>
-              <w:left w:val="single" w:color="000000" w:themeColor="text1" w:sz="4" w:space="0"/>
-              <w:bottom w:val="single" w:color="000000" w:themeColor="text1" w:sz="4" w:space="0"/>
-              <w:right w:val="single" w:color="000000" w:themeColor="text1" w:sz="4" w:space="0"/>
+              <w:top w:val="single" w:sz="4" w:space="0" w:color="000000"/>
+              <w:left w:val="single" w:sz="4" w:space="0" w:color="000000"/>
+              <w:bottom w:val="single" w:sz="4" w:space="0" w:color="000000"/>
+              <w:right w:val="single" w:sz="4" w:space="0" w:color="000000"/>
             </w:tcBorders>
-            <w:shd w:val="clear" w:color="auto" w:fill="BFBFBF" w:themeFill="background1" w:themeFillShade="BF"/>
-            <w:tcMar/>
+            <w:shd w:color="auto" w:fill="BFBFBF" w:themeFill="background1" w:themeFillShade="bf" w:val="clear"/>
           </w:tcPr>
-          <w:p wp14:textId="77777777">
+          <w:p>
             <w:pPr>
               <w:pStyle w:val="Normal"/>
               <w:widowControl w:val="false"/>
@@ -576,14 +564,42 @@
             </w:pPr>
             <w:r>
               <w:rPr>
+                <w:rFonts w:eastAsia="Calibri" w:cs="Calibri"/>
+                <w:color w:val="auto"/>
+                <w:kern w:val="0"/>
+                <w:sz w:val="22"/>
+                <w:szCs w:val="22"/>
+                <w:lang w:val="fr-FR" w:eastAsia="fr-FR" w:bidi="ar-SA"/>
+              </w:rPr>
+            </w:r>
+          </w:p>
+          <w:p>
+            <w:pPr>
+              <w:pStyle w:val="Normal"/>
+              <w:widowControl w:val="false"/>
+              <w:spacing w:before="0" w:after="160"/>
+              <w:jc w:val="center"/>
+              <w:rPr>
                 <w:b/>
+                <w:b/>
+              </w:rPr>
+            </w:pPr>
+            <w:r>
+              <w:rPr>
+                <w:rFonts w:eastAsia="Calibri" w:cs="Calibri"/>
+                <w:b/>
+                <w:color w:val="auto"/>
+                <w:kern w:val="0"/>
+                <w:sz w:val="22"/>
+                <w:szCs w:val="22"/>
+                <w:lang w:val="fr-FR" w:eastAsia="fr-FR" w:bidi="ar-SA"/>
               </w:rPr>
               <w:t>MONTANT</w:t>
             </w:r>
           </w:p>
         </w:tc>
       </w:tr>
-      <w:tr xmlns:wp14="http://schemas.microsoft.com/office/word/2010/wordml" wp14:textId="77777777">
+      <w:tr>
         <w:trPr>
           <w:trHeight w:val="567" w:hRule="atLeast"/>
         </w:trPr>
@@ -591,22 +607,21 @@
           <w:tcPr>
             <w:tcW w:w="6996" w:type="dxa"/>
             <w:tcBorders>
-              <w:top w:val="single" w:color="000000" w:themeColor="text1" w:sz="4" w:space="0"/>
-              <w:left w:val="single" w:color="000000" w:themeColor="text1" w:sz="4" w:space="0"/>
-              <w:bottom w:val="single" w:color="000000" w:themeColor="text1" w:sz="4" w:space="0"/>
-              <w:right w:val="single" w:color="000000" w:themeColor="text1" w:sz="4" w:space="0"/>
+              <w:top w:val="single" w:sz="4" w:space="0" w:color="000000"/>
+              <w:left w:val="single" w:sz="4" w:space="0" w:color="000000"/>
+              <w:bottom w:val="single" w:sz="4" w:space="0" w:color="000000"/>
+              <w:right w:val="single" w:sz="4" w:space="0" w:color="000000"/>
             </w:tcBorders>
-            <w:tcMar/>
           </w:tcPr>
-          <w:p wp14:textId="77777777">
+          <w:p>
             <w:pPr>
               <w:pStyle w:val="Normal"/>
-              <w:widowControl w:val="0"/>
-              <w:suppressLineNumbers w:val="0"/>
+              <w:widowControl w:val="false"/>
               <w:bidi w:val="0"/>
-              <w:spacing w:before="120" w:beforeAutospacing="off" w:after="240" w:afterAutospacing="off" w:line="259" w:lineRule="auto"/>
-              <w:ind w:left="0" w:right="0"/>
+              <w:spacing w:lineRule="auto" w:line="259" w:beforeAutospacing="0" w:before="120" w:afterAutospacing="0" w:after="240"/>
+              <w:ind w:left="0" w:right="0" w:hanging="0"/>
               <w:jc w:val="left"/>
+              <w:rPr/>
             </w:pPr>
             <w:r>
               <w:rPr/>
@@ -618,40 +633,28 @@
           <w:tcPr>
             <w:tcW w:w="2526" w:type="dxa"/>
             <w:tcBorders>
-              <w:top w:val="single" w:color="000000" w:themeColor="text1" w:sz="4" w:space="0"/>
-              <w:left w:val="single" w:color="000000" w:themeColor="text1" w:sz="4" w:space="0"/>
-              <w:bottom w:val="single" w:color="000000" w:themeColor="text1" w:sz="4" w:space="0"/>
-              <w:right w:val="single" w:color="000000" w:themeColor="text1" w:sz="4" w:space="0"/>
+              <w:top w:val="single" w:sz="4" w:space="0" w:color="000000"/>
+              <w:left w:val="single" w:sz="4" w:space="0" w:color="000000"/>
+              <w:bottom w:val="single" w:sz="4" w:space="0" w:color="000000"/>
+              <w:right w:val="single" w:sz="4" w:space="0" w:color="000000"/>
             </w:tcBorders>
-            <w:tcMar/>
           </w:tcPr>
-          <w:p wp14:textId="185EA1B2">
+          <w:p>
             <w:pPr>
               <w:pStyle w:val="Normal"/>
-              <w:widowControl w:val="0"/>
-              <w:spacing w:before="120" w:beforeAutospacing="off" w:after="240" w:afterAutospacing="off"/>
+              <w:widowControl w:val="false"/>
+              <w:spacing w:beforeAutospacing="0" w:before="120" w:afterAutospacing="0" w:after="240"/>
               <w:jc w:val="center"/>
+              <w:rPr/>
             </w:pPr>
             <w:r>
               <w:rPr/>
-              <w:t>{</w:t>
-            </w:r>
-            <w:r>
-              <w:rPr/>
-              <w:t>price_no_charge</w:t>
-            </w:r>
-            <w:r>
-              <w:rPr/>
-              <w:t>}</w:t>
-            </w:r>
-            <w:r>
-              <w:rPr/>
-              <w:t xml:space="preserve"> €</w:t>
+              <w:t>{price_no_charge} €</w:t>
             </w:r>
           </w:p>
         </w:tc>
       </w:tr>
-      <w:tr xmlns:wp14="http://schemas.microsoft.com/office/word/2010/wordml" wp14:textId="77777777">
+      <w:tr>
         <w:trPr>
           <w:trHeight w:val="593" w:hRule="atLeast"/>
         </w:trPr>
@@ -659,22 +662,21 @@
           <w:tcPr>
             <w:tcW w:w="6996" w:type="dxa"/>
             <w:tcBorders>
-              <w:top w:val="single" w:color="000000" w:themeColor="text1" w:sz="4" w:space="0"/>
-              <w:left w:val="single" w:color="000000" w:themeColor="text1" w:sz="4" w:space="0"/>
-              <w:bottom w:val="single" w:color="000000" w:themeColor="text1" w:sz="4" w:space="0"/>
-              <w:right w:val="single" w:color="000000" w:themeColor="text1" w:sz="4" w:space="0"/>
+              <w:top w:val="single" w:sz="4" w:space="0" w:color="000000"/>
+              <w:left w:val="single" w:sz="4" w:space="0" w:color="000000"/>
+              <w:bottom w:val="single" w:sz="4" w:space="0" w:color="000000"/>
+              <w:right w:val="single" w:sz="4" w:space="0" w:color="000000"/>
             </w:tcBorders>
-            <w:tcMar/>
           </w:tcPr>
-          <w:p wp14:textId="77777777">
+          <w:p>
             <w:pPr>
               <w:pStyle w:val="Normal"/>
-              <w:widowControl w:val="0"/>
-              <w:suppressLineNumbers w:val="0"/>
+              <w:widowControl w:val="false"/>
               <w:bidi w:val="0"/>
-              <w:spacing w:before="120" w:beforeAutospacing="off" w:after="240" w:afterAutospacing="off" w:line="259" w:lineRule="auto"/>
-              <w:ind w:left="0" w:right="0"/>
+              <w:spacing w:lineRule="auto" w:line="259" w:beforeAutospacing="0" w:before="120" w:afterAutospacing="0" w:after="240"/>
+              <w:ind w:left="0" w:right="0" w:hanging="0"/>
               <w:jc w:val="left"/>
+              <w:rPr/>
             </w:pPr>
             <w:r>
               <w:rPr/>
@@ -686,35 +688,30 @@
           <w:tcPr>
             <w:tcW w:w="2526" w:type="dxa"/>
             <w:tcBorders>
-              <w:top w:val="single" w:color="000000" w:themeColor="text1" w:sz="4" w:space="0"/>
-              <w:left w:val="single" w:color="000000" w:themeColor="text1" w:sz="4" w:space="0"/>
-              <w:bottom w:val="single" w:color="000000" w:themeColor="text1" w:sz="4" w:space="0"/>
-              <w:right w:val="single" w:color="000000" w:themeColor="text1" w:sz="4" w:space="0"/>
+              <w:top w:val="single" w:sz="4" w:space="0" w:color="000000"/>
+              <w:left w:val="single" w:sz="4" w:space="0" w:color="000000"/>
+              <w:bottom w:val="single" w:sz="4" w:space="0" w:color="000000"/>
+              <w:right w:val="single" w:sz="4" w:space="0" w:color="000000"/>
             </w:tcBorders>
-            <w:tcMar/>
           </w:tcPr>
-          <w:p wp14:textId="77777777">
+          <w:p>
             <w:pPr>
               <w:pStyle w:val="Normal"/>
-              <w:widowControl w:val="0"/>
-              <w:suppressLineNumbers w:val="0"/>
+              <w:widowControl w:val="false"/>
               <w:bidi w:val="0"/>
-              <w:spacing w:before="120" w:beforeAutospacing="off" w:after="240" w:afterAutospacing="off" w:line="259" w:lineRule="auto"/>
-              <w:ind w:left="0" w:right="0"/>
+              <w:spacing w:lineRule="auto" w:line="259" w:beforeAutospacing="0" w:before="120" w:afterAutospacing="0" w:after="240"/>
+              <w:ind w:left="0" w:right="0" w:hanging="0"/>
               <w:jc w:val="center"/>
+              <w:rPr/>
             </w:pPr>
             <w:r>
               <w:rPr/>
-              <w:t>{charge_price}</w:t>
-            </w:r>
-            <w:r>
-              <w:rPr/>
-              <w:t xml:space="preserve"> €</w:t>
+              <w:t>{charge_price} €</w:t>
             </w:r>
           </w:p>
         </w:tc>
       </w:tr>
-      <w:tr xmlns:wp14="http://schemas.microsoft.com/office/word/2010/wordml" wp14:textId="77777777">
+      <w:tr>
         <w:trPr>
           <w:trHeight w:val="567" w:hRule="atLeast"/>
         </w:trPr>
@@ -722,22 +719,21 @@
           <w:tcPr>
             <w:tcW w:w="6996" w:type="dxa"/>
             <w:tcBorders>
-              <w:top w:val="single" w:color="000000" w:themeColor="text1" w:sz="4" w:space="0"/>
-              <w:left w:val="single" w:color="000000" w:themeColor="text1" w:sz="4" w:space="0"/>
-              <w:bottom w:val="single" w:color="000000" w:themeColor="text1" w:sz="4" w:space="0"/>
-              <w:right w:val="single" w:color="000000" w:themeColor="text1" w:sz="4" w:space="0"/>
+              <w:top w:val="single" w:sz="4" w:space="0" w:color="000000"/>
+              <w:left w:val="single" w:sz="4" w:space="0" w:color="000000"/>
+              <w:bottom w:val="single" w:sz="4" w:space="0" w:color="000000"/>
+              <w:right w:val="single" w:sz="4" w:space="0" w:color="000000"/>
             </w:tcBorders>
-            <w:tcMar/>
           </w:tcPr>
-          <w:p wp14:textId="77777777">
+          <w:p>
             <w:pPr>
               <w:pStyle w:val="Normal"/>
-              <w:widowControl w:val="0"/>
-              <w:suppressLineNumbers w:val="0"/>
+              <w:widowControl w:val="false"/>
               <w:bidi w:val="0"/>
-              <w:spacing w:before="120" w:beforeAutospacing="off" w:after="240" w:afterAutospacing="off" w:line="259" w:lineRule="auto"/>
-              <w:ind w:left="0" w:right="0"/>
+              <w:spacing w:lineRule="auto" w:line="259" w:beforeAutospacing="0" w:before="120" w:afterAutospacing="0" w:after="240"/>
+              <w:ind w:left="0" w:right="0" w:hanging="0"/>
               <w:jc w:val="left"/>
+              <w:rPr/>
             </w:pPr>
             <w:r>
               <w:rPr/>
@@ -749,22 +745,21 @@
           <w:tcPr>
             <w:tcW w:w="2526" w:type="dxa"/>
             <w:tcBorders>
-              <w:top w:val="single" w:color="000000" w:themeColor="text1" w:sz="4" w:space="0"/>
-              <w:left w:val="single" w:color="000000" w:themeColor="text1" w:sz="4" w:space="0"/>
-              <w:bottom w:val="single" w:color="000000" w:themeColor="text1" w:sz="4" w:space="0"/>
-              <w:right w:val="single" w:color="000000" w:themeColor="text1" w:sz="4" w:space="0"/>
+              <w:top w:val="single" w:sz="4" w:space="0" w:color="000000"/>
+              <w:left w:val="single" w:sz="4" w:space="0" w:color="000000"/>
+              <w:bottom w:val="single" w:sz="4" w:space="0" w:color="000000"/>
+              <w:right w:val="single" w:sz="4" w:space="0" w:color="000000"/>
             </w:tcBorders>
-            <w:tcMar/>
           </w:tcPr>
-          <w:p wp14:textId="77777777">
+          <w:p>
             <w:pPr>
               <w:pStyle w:val="Normal"/>
-              <w:widowControl w:val="0"/>
-              <w:suppressLineNumbers w:val="0"/>
+              <w:widowControl w:val="false"/>
               <w:bidi w:val="0"/>
-              <w:spacing w:before="120" w:beforeAutospacing="off" w:after="240" w:afterAutospacing="off" w:line="259" w:lineRule="auto"/>
-              <w:ind w:left="0" w:right="0"/>
+              <w:spacing w:lineRule="auto" w:line="259" w:beforeAutospacing="0" w:before="120" w:afterAutospacing="0" w:after="240"/>
+              <w:ind w:left="0" w:right="0" w:hanging="0"/>
               <w:jc w:val="center"/>
+              <w:rPr/>
             </w:pPr>
             <w:r>
               <w:rPr/>
@@ -774,10 +769,10 @@
         </w:tc>
       </w:tr>
     </w:tbl>
-    <w:p xmlns:wp14="http://schemas.microsoft.com/office/word/2010/wordml" wp14:textId="77777777">
-      <w:pPr>
-        <w:pStyle w:val="Normal"/>
-        <w:spacing w:before="0" w:after="0" w:line="240" w:lineRule="auto"/>
+    <w:p>
+      <w:pPr>
+        <w:pStyle w:val="Normal"/>
+        <w:spacing w:lineRule="auto" w:line="240" w:before="0" w:after="0"/>
         <w:jc w:val="right"/>
         <w:rPr/>
       </w:pPr>
@@ -785,10 +780,10 @@
         <w:rPr/>
       </w:r>
     </w:p>
-    <w:p xmlns:wp14="http://schemas.microsoft.com/office/word/2010/wordml" wp14:textId="77777777">
-      <w:pPr>
-        <w:pStyle w:val="Normal"/>
-        <w:spacing w:before="0" w:after="0" w:line="240" w:lineRule="auto"/>
+    <w:p>
+      <w:pPr>
+        <w:pStyle w:val="Normal"/>
+        <w:spacing w:lineRule="auto" w:line="240" w:before="0" w:after="0"/>
         <w:jc w:val="right"/>
         <w:rPr/>
       </w:pPr>
@@ -796,27 +791,21 @@
         <w:rPr/>
       </w:r>
     </w:p>
-    <w:p xmlns:wp14="http://schemas.microsoft.com/office/word/2010/wordml" wp14:textId="77777777">
-      <w:pPr>
-        <w:pStyle w:val="Normal"/>
-        <w:spacing w:before="0" w:after="0" w:line="240" w:lineRule="auto"/>
+    <w:p>
+      <w:pPr>
+        <w:pStyle w:val="Normal"/>
+        <w:spacing w:lineRule="auto" w:line="240" w:before="0" w:after="0"/>
         <w:rPr/>
       </w:pPr>
       <w:r>
         <w:rPr/>
         <w:t>Date de paiement : {date_paiement}</w:t>
       </w:r>
-      <w:r>
-        <w:rPr/>
-      </w:r>
-      <w:r>
-        <w:rPr/>
-      </w:r>
-    </w:p>
-    <w:p xmlns:wp14="http://schemas.microsoft.com/office/word/2010/wordml" wp14:textId="77777777">
-      <w:pPr>
-        <w:pStyle w:val="Normal"/>
-        <w:spacing w:before="0" w:after="0" w:line="240" w:lineRule="auto"/>
+    </w:p>
+    <w:p>
+      <w:pPr>
+        <w:pStyle w:val="Normal"/>
+        <w:spacing w:lineRule="auto" w:line="240" w:before="0" w:after="0"/>
         <w:rPr/>
       </w:pPr>
       <w:r>
@@ -824,26 +813,30 @@
         <w:t>Mode de paiement : Virement bancaire</w:t>
       </w:r>
     </w:p>
-    <w:p xmlns:wp14="http://schemas.microsoft.com/office/word/2010/wordml" wp14:textId="6C88AF09">
-      <w:pPr>
-        <w:pStyle w:val="Normal"/>
-        <w:spacing w:before="0" w:after="0" w:line="240" w:lineRule="auto"/>
-      </w:pPr>
-    </w:p>
-    <w:p xmlns:wp14="http://schemas.microsoft.com/office/word/2010/wordml" wp14:textId="77777777">
-      <w:pPr>
-        <w:pStyle w:val="Normal"/>
-        <w:spacing w:before="0" w:after="0" w:line="240" w:lineRule="auto"/>
-        <w:rPr/>
-      </w:pPr>
-      <w:r>
-        <w:rPr/>
-      </w:r>
-    </w:p>
-    <w:p xmlns:wp14="http://schemas.microsoft.com/office/word/2010/wordml" wp14:textId="77777777">
-      <w:pPr>
-        <w:pStyle w:val="Normal"/>
-        <w:spacing w:before="0" w:after="0" w:line="240" w:lineRule="auto"/>
+    <w:p>
+      <w:pPr>
+        <w:pStyle w:val="Normal"/>
+        <w:spacing w:lineRule="auto" w:line="240" w:before="0" w:after="0"/>
+        <w:rPr/>
+      </w:pPr>
+      <w:r>
+        <w:rPr/>
+      </w:r>
+    </w:p>
+    <w:p>
+      <w:pPr>
+        <w:pStyle w:val="Normal"/>
+        <w:spacing w:lineRule="auto" w:line="240" w:before="0" w:after="0"/>
+        <w:rPr/>
+      </w:pPr>
+      <w:r>
+        <w:rPr/>
+      </w:r>
+    </w:p>
+    <w:p>
+      <w:pPr>
+        <w:pStyle w:val="Normal"/>
+        <w:spacing w:lineRule="auto" w:line="240" w:before="0" w:after="0"/>
         <w:jc w:val="right"/>
         <w:rPr/>
       </w:pPr>
@@ -852,221 +845,168 @@
         <w:t>S. BODIN</w:t>
       </w:r>
     </w:p>
-    <w:p xmlns:wp14="http://schemas.microsoft.com/office/word/2010/wordml" wp14:textId="77777777">
-      <w:pPr>
-        <w:pStyle w:val="Normal"/>
-        <w:spacing w:before="0" w:after="0" w:line="240" w:lineRule="auto"/>
+    <w:p>
+      <w:pPr>
+        <w:pStyle w:val="Normal"/>
+        <w:spacing w:lineRule="auto" w:line="240" w:before="0" w:after="0"/>
         <w:rPr>
           <w:highlight w:val="black"/>
         </w:rPr>
       </w:pPr>
       <w:r>
         <w:rPr/>
-        <mc:AlternateContent>
-          <mc:Choice Requires="wps">
-            <w:drawing>
-              <wp:anchor xmlns:wp14="http://schemas.microsoft.com/office/word/2010/wordprocessingDrawing" distT="0" distB="0" distL="114300" distR="114300" simplePos="0" relativeHeight="2" behindDoc="0" locked="0" layoutInCell="0" allowOverlap="1" wp14:anchorId="211F1682" wp14:editId="7777777">
-                <wp:simplePos x="0" y="0"/>
-                <wp:positionH relativeFrom="column">
-                  <wp:posOffset>4354830</wp:posOffset>
-                </wp:positionH>
-                <wp:positionV relativeFrom="paragraph">
-                  <wp:posOffset>149860</wp:posOffset>
-                </wp:positionV>
-                <wp:extent cx="847725" cy="394335"/>
-                <wp:effectExtent l="0" t="0" r="0" b="0"/>
-                <wp:wrapNone/>
-                <wp:docPr id="1" name="Encre 10"/>
-                <a:graphic xmlns:a="http://schemas.openxmlformats.org/drawingml/2006/main">
-                  <a:graphicData uri="http://schemas.openxmlformats.org/drawingml/2006/picture">
-                    <pic:pic xmlns:pic="http://schemas.openxmlformats.org/drawingml/2006/picture">
-                      <pic:nvPicPr>
-                        <pic:cNvPr id="0" name="Encre 10" descr=""/>
-                        <pic:cNvPicPr/>
-                      </pic:nvPicPr>
-                      <pic:blipFill>
-                        <a:blip r:embed="rId2"/>
-                        <a:stretch/>
-                      </pic:blipFill>
-                      <pic:spPr>
-                        <a:xfrm>
-                          <a:off x="0" y="0"/>
-                          <a:ext cx="847800" cy="394200"/>
-                        </a:xfrm>
-                        <a:prstGeom prst="rect">
-                          <a:avLst/>
-                        </a:prstGeom>
-                        <a:ln w="0">
-                          <a:noFill/>
-                        </a:ln>
-                      </pic:spPr>
-                    </pic:pic>
-                  </a:graphicData>
-                </a:graphic>
-              </wp:anchor>
-            </w:drawing>
-          </mc:Choice>
-          <mc:Fallback>
-            <w:pict w14:anchorId="36533124">
-              <v:shapetype id="_x0000_t75" coordsize="21600,21600" filled="f" stroked="f" o:spt="75" o:preferrelative="t" path="m@4@5l@4@11@9@11@9@5xe">
-                <v:stroke joinstyle="miter"/>
-                <v:formulas>
-                  <v:f eqn="if lineDrawn pixelLineWidth 0"/>
-                  <v:f eqn="sum @0 1 0"/>
-                  <v:f eqn="sum 0 0 @1"/>
-                  <v:f eqn="prod @2 1 2"/>
-                  <v:f eqn="prod @3 21600 pixelWidth"/>
-                  <v:f eqn="prod @3 21600 pixelHeight"/>
-                  <v:f eqn="sum @0 0 1"/>
-                  <v:f eqn="prod @6 1 2"/>
-                  <v:f eqn="prod @7 21600 pixelWidth"/>
-                  <v:f eqn="sum @8 21600 0"/>
-                  <v:f eqn="prod @7 21600 pixelHeight"/>
-                  <v:f eqn="sum @10 21600 0"/>
-                </v:formulas>
-                <v:path gradientshapeok="t" o:connecttype="rect" o:extrusionok="f"/>
-                <o:lock v:ext="edit" aspectratio="t"/>
-              </v:shapetype>
-              <v:shape id="shape_0" style="position:absolute;margin-left:342.9pt;margin-top:11.8pt;width:66.7pt;height:31pt;mso-wrap-style:none;v-text-anchor:middle" o:allowincell="f" stroked="f" type="_x0000_t75" ID="Encre 10">
-                <v:imagedata o:detectmouseclick="t" r:id="rId2"/>
-                <v:stroke color="#3465a4" joinstyle="round" endcap="flat"/>
-                <w10:wrap type="none"/>
-              </v:shape>
-            </w:pict>
-          </mc:Fallback>
-        </mc:AlternateContent>
-      </w:r>
-      <w:r>
-        <w:rPr/>
-        <mc:AlternateContent>
-          <mc:Choice Requires="wps">
-            <w:drawing>
-              <wp:anchor xmlns:wp14="http://schemas.microsoft.com/office/word/2010/wordprocessingDrawing" distT="0" distB="0" distL="114300" distR="114300" simplePos="0" relativeHeight="3" behindDoc="0" locked="0" layoutInCell="0" allowOverlap="1" wp14:anchorId="4C025E3F" wp14:editId="7777777">
-                <wp:simplePos x="0" y="0"/>
-                <wp:positionH relativeFrom="column">
-                  <wp:posOffset>5163820</wp:posOffset>
-                </wp:positionH>
-                <wp:positionV relativeFrom="paragraph">
-                  <wp:posOffset>297815</wp:posOffset>
-                </wp:positionV>
-                <wp:extent cx="145415" cy="80645"/>
-                <wp:effectExtent l="0" t="0" r="0" b="0"/>
-                <wp:wrapNone/>
-                <wp:docPr id="2" name="Encre 12"/>
-                <a:graphic xmlns:a="http://schemas.openxmlformats.org/drawingml/2006/main">
-                  <a:graphicData uri="http://schemas.openxmlformats.org/drawingml/2006/picture">
-                    <pic:pic xmlns:pic="http://schemas.openxmlformats.org/drawingml/2006/picture">
-                      <pic:nvPicPr>
-                        <pic:cNvPr id="1" name="Encre 12" descr=""/>
-                        <pic:cNvPicPr/>
-                      </pic:nvPicPr>
-                      <pic:blipFill>
-                        <a:blip r:embed="rId3"/>
-                        <a:stretch/>
-                      </pic:blipFill>
-                      <pic:spPr>
-                        <a:xfrm>
-                          <a:off x="0" y="0"/>
-                          <a:ext cx="145440" cy="80640"/>
-                        </a:xfrm>
-                        <a:prstGeom prst="rect">
-                          <a:avLst/>
-                        </a:prstGeom>
-                        <a:ln w="0">
-                          <a:noFill/>
-                        </a:ln>
-                      </pic:spPr>
-                    </pic:pic>
-                  </a:graphicData>
-                </a:graphic>
-              </wp:anchor>
-            </w:drawing>
-          </mc:Choice>
-          <mc:Fallback>
-            <w:pict w14:anchorId="5F44239C">
-              <v:shape id="shape_0" style="position:absolute;margin-left:406.6pt;margin-top:23.45pt;width:11.4pt;height:6.3pt;mso-wrap-style:none;v-text-anchor:middle" o:allowincell="f" stroked="f" type="_x0000_t75" ID="Encre 12">
-                <v:imagedata o:detectmouseclick="t" r:id="rId3"/>
-                <v:stroke color="#3465a4" joinstyle="round" endcap="flat"/>
-                <w10:wrap type="none"/>
-              </v:shape>
-            </w:pict>
-          </mc:Fallback>
-        </mc:AlternateContent>
-      </w:r>
-      <w:r>
-        <w:rPr/>
-        <mc:AlternateContent>
-          <mc:Choice Requires="wps">
-            <w:drawing>
-              <wp:anchor xmlns:wp14="http://schemas.microsoft.com/office/word/2010/wordprocessingDrawing" distT="0" distB="0" distL="114300" distR="114300" simplePos="0" relativeHeight="4" behindDoc="0" locked="0" layoutInCell="0" allowOverlap="1" wp14:anchorId="520706B0" wp14:editId="7777777">
-                <wp:simplePos x="0" y="0"/>
-                <wp:positionH relativeFrom="column">
-                  <wp:posOffset>5134610</wp:posOffset>
-                </wp:positionH>
-                <wp:positionV relativeFrom="paragraph">
-                  <wp:posOffset>278765</wp:posOffset>
-                </wp:positionV>
-                <wp:extent cx="13335" cy="13335"/>
-                <wp:effectExtent l="0" t="0" r="0" b="0"/>
-                <wp:wrapNone/>
-                <wp:docPr id="3" name="Encre 15"/>
-                <a:graphic xmlns:a="http://schemas.openxmlformats.org/drawingml/2006/main">
-                  <a:graphicData uri="http://schemas.openxmlformats.org/drawingml/2006/picture">
-                    <pic:pic xmlns:pic="http://schemas.openxmlformats.org/drawingml/2006/picture">
-                      <pic:nvPicPr>
-                        <pic:cNvPr id="2" name="Encre 15" descr=""/>
-                        <pic:cNvPicPr/>
-                      </pic:nvPicPr>
-                      <pic:blipFill>
-                        <a:blip r:embed="rId4"/>
-                        <a:stretch/>
-                      </pic:blipFill>
-                      <pic:spPr>
-                        <a:xfrm>
-                          <a:off x="0" y="0"/>
-                          <a:ext cx="13320" cy="13320"/>
-                        </a:xfrm>
-                        <a:prstGeom prst="rect">
-                          <a:avLst/>
-                        </a:prstGeom>
-                        <a:ln w="0">
-                          <a:noFill/>
-                        </a:ln>
-                      </pic:spPr>
-                    </pic:pic>
-                  </a:graphicData>
-                </a:graphic>
-              </wp:anchor>
-            </w:drawing>
-          </mc:Choice>
-          <mc:Fallback>
-            <w:pict w14:anchorId="3C53DD94">
-              <v:shape id="shape_0" style="position:absolute;margin-left:404.3pt;margin-top:21.95pt;width:1pt;height:1pt;mso-wrap-style:none;v-text-anchor:middle" o:allowincell="f" stroked="f" type="_x0000_t75" ID="Encre 15">
-                <v:imagedata o:detectmouseclick="t" r:id="rId4"/>
-                <v:stroke color="#3465a4" joinstyle="round" endcap="flat"/>
-                <w10:wrap type="none"/>
-              </v:shape>
-            </w:pict>
-          </mc:Fallback>
-        </mc:AlternateContent>
+        <w:drawing>
+          <wp:anchor behindDoc="0" distT="0" distB="0" distL="0" distR="0" simplePos="0" locked="0" layoutInCell="0" allowOverlap="1" relativeHeight="2">
+            <wp:simplePos x="0" y="0"/>
+            <wp:positionH relativeFrom="column">
+              <wp:posOffset>4354830</wp:posOffset>
+            </wp:positionH>
+            <wp:positionV relativeFrom="paragraph">
+              <wp:posOffset>149860</wp:posOffset>
+            </wp:positionV>
+            <wp:extent cx="847725" cy="394335"/>
+            <wp:effectExtent l="0" t="0" r="0" b="0"/>
+            <wp:wrapNone/>
+            <wp:docPr id="1" name="Encre 10" descr=""/>
+            <wp:cNvGraphicFramePr>
+              <a:graphicFrameLocks xmlns:a="http://schemas.openxmlformats.org/drawingml/2006/main" noChangeAspect="1"/>
+            </wp:cNvGraphicFramePr>
+            <a:graphic xmlns:a="http://schemas.openxmlformats.org/drawingml/2006/main">
+              <a:graphicData uri="http://schemas.openxmlformats.org/drawingml/2006/picture">
+                <pic:pic xmlns:pic="http://schemas.openxmlformats.org/drawingml/2006/picture">
+                  <pic:nvPicPr>
+                    <pic:cNvPr id="1" name="Encre 10" descr=""/>
+                    <pic:cNvPicPr>
+                      <a:picLocks noChangeAspect="1" noChangeArrowheads="1"/>
+                    </pic:cNvPicPr>
+                  </pic:nvPicPr>
+                  <pic:blipFill>
+                    <a:blip r:embed="rId2"/>
+                    <a:stretch>
+                      <a:fillRect/>
+                    </a:stretch>
+                  </pic:blipFill>
+                  <pic:spPr bwMode="auto">
+                    <a:xfrm>
+                      <a:off x="0" y="0"/>
+                      <a:ext cx="847725" cy="394335"/>
+                    </a:xfrm>
+                    <a:prstGeom prst="rect">
+                      <a:avLst/>
+                    </a:prstGeom>
+                  </pic:spPr>
+                </pic:pic>
+              </a:graphicData>
+            </a:graphic>
+          </wp:anchor>
+        </w:drawing>
+        <w:drawing>
+          <wp:anchor behindDoc="0" distT="0" distB="0" distL="0" distR="0" simplePos="0" locked="0" layoutInCell="0" allowOverlap="1" relativeHeight="3">
+            <wp:simplePos x="0" y="0"/>
+            <wp:positionH relativeFrom="column">
+              <wp:posOffset>5163820</wp:posOffset>
+            </wp:positionH>
+            <wp:positionV relativeFrom="paragraph">
+              <wp:posOffset>297815</wp:posOffset>
+            </wp:positionV>
+            <wp:extent cx="145415" cy="80645"/>
+            <wp:effectExtent l="0" t="0" r="0" b="0"/>
+            <wp:wrapNone/>
+            <wp:docPr id="2" name="Encre 12" descr=""/>
+            <wp:cNvGraphicFramePr>
+              <a:graphicFrameLocks xmlns:a="http://schemas.openxmlformats.org/drawingml/2006/main" noChangeAspect="1"/>
+            </wp:cNvGraphicFramePr>
+            <a:graphic xmlns:a="http://schemas.openxmlformats.org/drawingml/2006/main">
+              <a:graphicData uri="http://schemas.openxmlformats.org/drawingml/2006/picture">
+                <pic:pic xmlns:pic="http://schemas.openxmlformats.org/drawingml/2006/picture">
+                  <pic:nvPicPr>
+                    <pic:cNvPr id="2" name="Encre 12" descr=""/>
+                    <pic:cNvPicPr>
+                      <a:picLocks noChangeAspect="1" noChangeArrowheads="1"/>
+                    </pic:cNvPicPr>
+                  </pic:nvPicPr>
+                  <pic:blipFill>
+                    <a:blip r:embed="rId3"/>
+                    <a:stretch>
+                      <a:fillRect/>
+                    </a:stretch>
+                  </pic:blipFill>
+                  <pic:spPr bwMode="auto">
+                    <a:xfrm>
+                      <a:off x="0" y="0"/>
+                      <a:ext cx="145415" cy="80645"/>
+                    </a:xfrm>
+                    <a:prstGeom prst="rect">
+                      <a:avLst/>
+                    </a:prstGeom>
+                  </pic:spPr>
+                </pic:pic>
+              </a:graphicData>
+            </a:graphic>
+          </wp:anchor>
+        </w:drawing>
+        <w:drawing>
+          <wp:anchor behindDoc="0" distT="0" distB="0" distL="0" distR="0" simplePos="0" locked="0" layoutInCell="0" allowOverlap="1" relativeHeight="4">
+            <wp:simplePos x="0" y="0"/>
+            <wp:positionH relativeFrom="column">
+              <wp:posOffset>5134610</wp:posOffset>
+            </wp:positionH>
+            <wp:positionV relativeFrom="paragraph">
+              <wp:posOffset>278765</wp:posOffset>
+            </wp:positionV>
+            <wp:extent cx="13335" cy="13335"/>
+            <wp:effectExtent l="0" t="0" r="0" b="0"/>
+            <wp:wrapNone/>
+            <wp:docPr id="3" name="Encre 15" descr=""/>
+            <wp:cNvGraphicFramePr>
+              <a:graphicFrameLocks xmlns:a="http://schemas.openxmlformats.org/drawingml/2006/main" noChangeAspect="1"/>
+            </wp:cNvGraphicFramePr>
+            <a:graphic xmlns:a="http://schemas.openxmlformats.org/drawingml/2006/main">
+              <a:graphicData uri="http://schemas.openxmlformats.org/drawingml/2006/picture">
+                <pic:pic xmlns:pic="http://schemas.openxmlformats.org/drawingml/2006/picture">
+                  <pic:nvPicPr>
+                    <pic:cNvPr id="3" name="Encre 15" descr=""/>
+                    <pic:cNvPicPr>
+                      <a:picLocks noChangeAspect="1" noChangeArrowheads="1"/>
+                    </pic:cNvPicPr>
+                  </pic:nvPicPr>
+                  <pic:blipFill>
+                    <a:blip r:embed="rId4"/>
+                    <a:stretch>
+                      <a:fillRect/>
+                    </a:stretch>
+                  </pic:blipFill>
+                  <pic:spPr bwMode="auto">
+                    <a:xfrm>
+                      <a:off x="0" y="0"/>
+                      <a:ext cx="13335" cy="13335"/>
+                    </a:xfrm>
+                    <a:prstGeom prst="rect">
+                      <a:avLst/>
+                    </a:prstGeom>
+                  </pic:spPr>
+                </pic:pic>
+              </a:graphicData>
+            </a:graphic>
+          </wp:anchor>
+        </w:drawing>
       </w:r>
     </w:p>
     <w:sectPr>
       <w:type w:val="nextPage"/>
-      <w:pgSz w:w="11906" w:h="16838" w:orient="portrait"/>
-      <w:pgMar w:top="1417" w:right="1417" w:bottom="1417" w:left="1417" w:header="0" w:footer="0" w:gutter="0"/>
-      <w:pgNumType w:fmt="decimal" w:start="1"/>
+      <w:pgSz w:w="11906" w:h="16838"/>
+      <w:pgMar w:left="1417" w:right="1417" w:gutter="0" w:header="0" w:top="1417" w:footer="0" w:bottom="1417"/>
+      <w:pgNumType w:start="1" w:fmt="decimal"/>
       <w:formProt w:val="false"/>
       <w:textDirection w:val="lrTb"/>
       <w:docGrid w:type="default" w:linePitch="100" w:charSpace="4096"/>
-      <w:cols w:num="1"/>
     </w:sectPr>
   </w:body>
 </w:document>
 </file>
 
 <file path=word/styles.xml><?xml version="1.0" encoding="utf-8"?>
-<w:styles xmlns:wp14="http://schemas.microsoft.com/office/word/2010/wordprocessingDrawing" xmlns:w="http://schemas.openxmlformats.org/wordprocessingml/2006/main" xmlns:w14="http://schemas.microsoft.com/office/word/2010/wordml" xmlns:mc="http://schemas.openxmlformats.org/markup-compatibility/2006" mc:Ignorable="w14 wp14">
+<w:styles xmlns:w="http://schemas.openxmlformats.org/wordprocessingml/2006/main" xmlns:w14="http://schemas.microsoft.com/office/word/2010/wordml" xmlns:mc="http://schemas.openxmlformats.org/markup-compatibility/2006" mc:Ignorable="w14">
   <w:docDefaults>
     <w:rPrDefault>
       <w:rPr>
@@ -1465,8 +1405,9 @@
     <w:qFormat/>
     <w:pPr>
       <w:widowControl/>
+      <w:suppressAutoHyphens w:val="true"/>
       <w:bidi w:val="0"/>
-      <w:spacing w:before="0" w:after="160" w:line="259" w:lineRule="auto"/>
+      <w:spacing w:lineRule="auto" w:line="259" w:before="0" w:after="160"/>
       <w:jc w:val="left"/>
     </w:pPr>
     <w:rPr>
@@ -1479,7 +1420,7 @@
     </w:rPr>
   </w:style>
   <w:style w:type="paragraph" w:styleId="Heading1">
-    <w:name w:val="heading 1"/>
+    <w:name w:val="Heading 1"/>
     <w:basedOn w:val="Normal"/>
     <w:next w:val="Normal"/>
     <w:uiPriority w:val="9"/>
@@ -1497,7 +1438,7 @@
     </w:rPr>
   </w:style>
   <w:style w:type="paragraph" w:styleId="Heading2">
-    <w:name w:val="heading 2"/>
+    <w:name w:val="Heading 2"/>
     <w:basedOn w:val="Normal"/>
     <w:next w:val="Normal"/>
     <w:uiPriority w:val="9"/>
@@ -1517,7 +1458,7 @@
     </w:rPr>
   </w:style>
   <w:style w:type="paragraph" w:styleId="Heading3">
-    <w:name w:val="heading 3"/>
+    <w:name w:val="Heading 3"/>
     <w:basedOn w:val="Normal"/>
     <w:next w:val="Normal"/>
     <w:uiPriority w:val="9"/>
@@ -1537,7 +1478,7 @@
     </w:rPr>
   </w:style>
   <w:style w:type="paragraph" w:styleId="Heading4">
-    <w:name w:val="heading 4"/>
+    <w:name w:val="Heading 4"/>
     <w:basedOn w:val="Normal"/>
     <w:next w:val="Normal"/>
     <w:uiPriority w:val="9"/>
@@ -1557,7 +1498,7 @@
     </w:rPr>
   </w:style>
   <w:style w:type="paragraph" w:styleId="Heading5">
-    <w:name w:val="heading 5"/>
+    <w:name w:val="Heading 5"/>
     <w:basedOn w:val="Normal"/>
     <w:next w:val="Normal"/>
     <w:uiPriority w:val="9"/>
@@ -1575,7 +1516,7 @@
     </w:rPr>
   </w:style>
   <w:style w:type="paragraph" w:styleId="Heading6">
-    <w:name w:val="heading 6"/>
+    <w:name w:val="Heading 6"/>
     <w:basedOn w:val="Normal"/>
     <w:next w:val="Normal"/>
     <w:uiPriority w:val="9"/>
@@ -1621,7 +1562,7 @@
     <w:name w:val="Body Text"/>
     <w:basedOn w:val="Normal"/>
     <w:pPr>
-      <w:spacing w:before="0" w:after="140" w:line="276" w:lineRule="auto"/>
+      <w:spacing w:lineRule="auto" w:line="276" w:before="0" w:after="140"/>
     </w:pPr>
     <w:rPr/>
   </w:style>
@@ -1696,6 +1637,29 @@
       <w:szCs w:val="48"/>
     </w:rPr>
   </w:style>
+  <w:style w:type="paragraph" w:styleId="TableContents">
+    <w:name w:val="Table Contents"/>
+    <w:basedOn w:val="Normal"/>
+    <w:qFormat/>
+    <w:pPr>
+      <w:widowControl w:val="false"/>
+      <w:suppressLineNumbers/>
+    </w:pPr>
+    <w:rPr/>
+  </w:style>
+  <w:style w:type="paragraph" w:styleId="TableHeading">
+    <w:name w:val="Table Heading"/>
+    <w:basedOn w:val="TableContents"/>
+    <w:qFormat/>
+    <w:pPr>
+      <w:suppressLineNumbers/>
+      <w:jc w:val="center"/>
+    </w:pPr>
+    <w:rPr>
+      <w:b/>
+      <w:bCs/>
+    </w:rPr>
+  </w:style>
   <w:style w:type="numbering" w:styleId="NoList" w:default="1">
     <w:name w:val="No List"/>
     <w:uiPriority w:val="99"/>
@@ -1703,7 +1667,7 @@
     <w:unhideWhenUsed/>
     <w:qFormat/>
   </w:style>
-  <w:style w:type="table" w:styleId="TableauNormal" w:default="1">
+  <w:style w:type="table" w:default="1" w:styleId="TableauNormal">
     <w:name w:val="Normal Table"/>
     <w:uiPriority w:val="99"/>
     <w:semiHidden/>
@@ -1717,7 +1681,7 @@
       </w:tblCellMar>
     </w:tblPr>
   </w:style>
-  <w:style w:type="table" w:styleId="TableNormal" w:customStyle="1">
+  <w:style w:type="table" w:customStyle="1" w:styleId="TableNormal">
     <w:name w:val="Table Normal"/>
     <w:tblPr>
       <w:tblCellMar>

</xml_diff>

<commit_message>
feat: docx signature quittance (#60)
Co-authored-by: Christian COLEY <christian.coley@smile.com>
</commit_message>
<xml_diff>
--- a/src/assets/docx/Quittance_de_loyer.docx
+++ b/src/assets/docx/Quittance_de_loyer.docx
@@ -1,8 +1,8 @@
 
 <file path=word/document.xml><?xml version="1.0" encoding="utf-8"?>
-<w:document xmlns:o="urn:schemas-microsoft-com:office:office" xmlns:r="http://schemas.openxmlformats.org/officeDocument/2006/relationships" xmlns:v="urn:schemas-microsoft-com:vml" xmlns:w="http://schemas.openxmlformats.org/wordprocessingml/2006/main" xmlns:w10="urn:schemas-microsoft-com:office:word" xmlns:wp="http://schemas.openxmlformats.org/drawingml/2006/wordprocessingDrawing" xmlns:wps="http://schemas.microsoft.com/office/word/2010/wordprocessingShape" xmlns:wpg="http://schemas.microsoft.com/office/word/2010/wordprocessingGroup" xmlns:mc="http://schemas.openxmlformats.org/markup-compatibility/2006" xmlns:wp14="http://schemas.microsoft.com/office/word/2010/wordprocessingDrawing" xmlns:w14="http://schemas.microsoft.com/office/word/2010/wordml" xmlns:w15="http://schemas.microsoft.com/office/word/2012/wordml" xmlns:a="http://schemas.openxmlformats.org/drawingml/2006/main" xmlns:pic="http://schemas.openxmlformats.org/drawingml/2006/picture" mc:Ignorable="w14 wp14 w15">
+<w:document xmlns:o="urn:schemas-microsoft-com:office:office" xmlns:r="http://schemas.openxmlformats.org/officeDocument/2006/relationships" xmlns:v="urn:schemas-microsoft-com:vml" xmlns:w="http://schemas.openxmlformats.org/wordprocessingml/2006/main" xmlns:w10="urn:schemas-microsoft-com:office:word" xmlns:wp="http://schemas.openxmlformats.org/drawingml/2006/wordprocessingDrawing" xmlns:wps="http://schemas.microsoft.com/office/word/2010/wordprocessingShape" xmlns:wpg="http://schemas.microsoft.com/office/word/2010/wordprocessingGroup" xmlns:mc="http://schemas.openxmlformats.org/markup-compatibility/2006" xmlns:wp14="http://schemas.microsoft.com/office/word/2010/wordprocessingDrawing" xmlns:w14="http://schemas.microsoft.com/office/word/2010/wordml" xmlns:w15="http://schemas.microsoft.com/office/word/2012/wordml" mc:Ignorable="w14 wp14 w15">
   <w:body>
-    <w:p xmlns:wp14="http://schemas.microsoft.com/office/word/2010/wordml" wp14:textId="68FC43FD">
+    <w:p>
       <w:pPr>
         <w:pStyle w:val="Normal"/>
         <w:jc w:val="center"/>
@@ -19,7 +19,7 @@
         <w:t>QUITTANCE DE LOYER</w:t>
       </w:r>
     </w:p>
-    <w:p xmlns:wp14="http://schemas.microsoft.com/office/word/2010/wordml" wp14:textId="77777777">
+    <w:p>
       <w:pPr>
         <w:pStyle w:val="Normal"/>
         <w:jc w:val="center"/>
@@ -33,40 +33,19 @@
           <w:sz w:val="24"/>
           <w:szCs w:val="24"/>
         </w:rPr>
-        <w:t xml:space="preserve">Période du </w:t>
-      </w:r>
-      <w:r>
-        <w:rPr>
-          <w:sz w:val="24"/>
-          <w:szCs w:val="24"/>
-        </w:rPr>
-        <w:t>{date_from}</w:t>
-      </w:r>
-      <w:r>
-        <w:rPr>
-          <w:sz w:val="24"/>
-          <w:szCs w:val="24"/>
-        </w:rPr>
-        <w:t xml:space="preserve"> au   </w:t>
-      </w:r>
-      <w:r>
-        <w:rPr>
-          <w:sz w:val="24"/>
-          <w:szCs w:val="24"/>
-        </w:rPr>
-        <w:t>{date_to}</w:t>
-      </w:r>
-    </w:p>
-    <w:p xmlns:wp14="http://schemas.microsoft.com/office/word/2010/wordml" wp14:textId="77777777">
-      <w:pPr>
-        <w:pStyle w:val="Normal"/>
-        <w:rPr/>
-      </w:pPr>
-      <w:r>
-        <w:rPr/>
-      </w:r>
-    </w:p>
-    <w:p xmlns:wp14="http://schemas.microsoft.com/office/word/2010/wordml" wp14:textId="77777777">
+        <w:t>Période du {date_from} au {date_to}</w:t>
+      </w:r>
+    </w:p>
+    <w:p>
+      <w:pPr>
+        <w:pStyle w:val="Normal"/>
+        <w:rPr/>
+      </w:pPr>
+      <w:r>
+        <w:rPr/>
+      </w:r>
+    </w:p>
+    <w:p>
       <w:pPr>
         <w:pStyle w:val="Normal"/>
         <w:rPr>
@@ -93,20 +72,20 @@
           <w:bottom w:w="0" w:type="dxa"/>
           <w:right w:w="108" w:type="dxa"/>
         </w:tblCellMar>
-        <w:tblLook w:val="0400" w:firstRow="0" w:lastRow="0" w:firstColumn="0" w:lastColumn="0" w:noHBand="0" w:noVBand="1"/>
+        <w:tblLook w:val="0400" w:noHBand="0" w:noVBand="1" w:firstColumn="0" w:lastRow="0" w:lastColumn="0" w:firstRow="0"/>
       </w:tblPr>
       <w:tblGrid>
         <w:gridCol w:w="5669"/>
         <w:gridCol w:w="3686"/>
       </w:tblGrid>
-      <w:tr xmlns:wp14="http://schemas.microsoft.com/office/word/2010/wordml" wp14:textId="77777777">
+      <w:tr>
         <w:trPr/>
         <w:tc>
           <w:tcPr>
             <w:tcW w:w="5669" w:type="dxa"/>
             <w:tcBorders/>
           </w:tcPr>
-          <w:p wp14:textId="77777777">
+          <w:p>
             <w:pPr>
               <w:pStyle w:val="Normal"/>
               <w:widowControl w:val="false"/>
@@ -123,7 +102,7 @@
               <w:t xml:space="preserve"> </w:t>
             </w:r>
           </w:p>
-          <w:p wp14:textId="77777777">
+          <w:p>
             <w:pPr>
               <w:pStyle w:val="Normal"/>
               <w:widowControl w:val="false"/>
@@ -133,7 +112,7 @@
               <w:rPr/>
             </w:r>
           </w:p>
-          <w:p wp14:textId="77777777">
+          <w:p>
             <w:pPr>
               <w:pStyle w:val="Normal"/>
               <w:widowControl w:val="false"/>
@@ -144,7 +123,7 @@
               <w:t xml:space="preserve">{nom_bailleur} {prenom_bailleur} </w:t>
             </w:r>
           </w:p>
-          <w:p wp14:textId="77777777">
+          <w:p>
             <w:pPr>
               <w:pStyle w:val="Normal"/>
               <w:widowControl w:val="false"/>
@@ -155,7 +134,7 @@
               <w:t>{adresse_bailleur}</w:t>
             </w:r>
           </w:p>
-          <w:p wp14:textId="77777777">
+          <w:p>
             <w:pPr>
               <w:pStyle w:val="Normal"/>
               <w:widowControl w:val="false"/>
@@ -166,7 +145,7 @@
               <w:t>{cp_ville_bailleur}</w:t>
             </w:r>
           </w:p>
-          <w:p wp14:textId="77777777">
+          <w:p>
             <w:pPr>
               <w:pStyle w:val="Normal"/>
               <w:widowControl w:val="false"/>
@@ -183,7 +162,7 @@
             <w:tcW w:w="3686" w:type="dxa"/>
             <w:tcBorders/>
           </w:tcPr>
-          <w:p wp14:textId="77777777">
+          <w:p>
             <w:pPr>
               <w:pStyle w:val="Normal"/>
               <w:widowControl w:val="false"/>
@@ -200,7 +179,7 @@
               <w:t>Locataire</w:t>
             </w:r>
           </w:p>
-          <w:p wp14:textId="77777777">
+          <w:p>
             <w:pPr>
               <w:pStyle w:val="Normal"/>
               <w:widowControl w:val="false"/>
@@ -216,7 +195,7 @@
               </w:rPr>
             </w:r>
           </w:p>
-          <w:p wp14:textId="77777777">
+          <w:p>
             <w:pPr>
               <w:pStyle w:val="Normal"/>
               <w:widowControl w:val="false"/>
@@ -228,7 +207,7 @@
               <w:t xml:space="preserve">{nom_locataire} {prenom_locataire} </w:t>
             </w:r>
           </w:p>
-          <w:p wp14:textId="77777777">
+          <w:p>
             <w:pPr>
               <w:pStyle w:val="Normal"/>
               <w:widowControl w:val="false"/>
@@ -240,7 +219,7 @@
               <w:t>{adresse_locataire}</w:t>
             </w:r>
           </w:p>
-          <w:p wp14:textId="77777777">
+          <w:p>
             <w:pPr>
               <w:pStyle w:val="Normal"/>
               <w:widowControl w:val="false"/>
@@ -259,30 +238,30 @@
         </w:tc>
       </w:tr>
     </w:tbl>
-    <w:p xmlns:wp14="http://schemas.microsoft.com/office/word/2010/wordml" wp14:textId="77777777">
-      <w:pPr>
-        <w:pStyle w:val="Normal"/>
-        <w:spacing w:before="0" w:after="0" w:line="240" w:lineRule="auto"/>
-        <w:rPr/>
-      </w:pPr>
-      <w:r>
-        <w:rPr/>
-      </w:r>
-    </w:p>
-    <w:p xmlns:wp14="http://schemas.microsoft.com/office/word/2010/wordml" wp14:textId="77777777">
-      <w:pPr>
-        <w:pStyle w:val="Normal"/>
-        <w:spacing w:before="0" w:after="0" w:line="240" w:lineRule="auto"/>
-        <w:rPr/>
-      </w:pPr>
-      <w:r>
-        <w:rPr/>
-      </w:r>
-    </w:p>
-    <w:p xmlns:wp14="http://schemas.microsoft.com/office/word/2010/wordml" wp14:textId="77777777">
-      <w:pPr>
-        <w:pStyle w:val="Normal"/>
-        <w:spacing w:before="0" w:after="0" w:line="240" w:lineRule="auto"/>
+    <w:p>
+      <w:pPr>
+        <w:pStyle w:val="Normal"/>
+        <w:spacing w:lineRule="auto" w:line="240" w:before="0" w:after="0"/>
+        <w:rPr/>
+      </w:pPr>
+      <w:r>
+        <w:rPr/>
+      </w:r>
+    </w:p>
+    <w:p>
+      <w:pPr>
+        <w:pStyle w:val="Normal"/>
+        <w:spacing w:lineRule="auto" w:line="240" w:before="0" w:after="0"/>
+        <w:rPr/>
+      </w:pPr>
+      <w:r>
+        <w:rPr/>
+      </w:r>
+    </w:p>
+    <w:p>
+      <w:pPr>
+        <w:pStyle w:val="Normal"/>
+        <w:spacing w:lineRule="auto" w:line="240" w:before="0" w:after="0"/>
         <w:jc w:val="right"/>
         <w:rPr/>
       </w:pPr>
@@ -291,10 +270,10 @@
         <w:t>Fait à {ville_signature}, le {date_now}</w:t>
       </w:r>
     </w:p>
-    <w:p xmlns:wp14="http://schemas.microsoft.com/office/word/2010/wordml" wp14:textId="77777777">
-      <w:pPr>
-        <w:pStyle w:val="Normal"/>
-        <w:spacing w:before="0" w:after="0" w:line="240" w:lineRule="auto"/>
+    <w:p>
+      <w:pPr>
+        <w:pStyle w:val="Normal"/>
+        <w:spacing w:lineRule="auto" w:line="240" w:before="0" w:after="0"/>
         <w:jc w:val="right"/>
         <w:rPr/>
       </w:pPr>
@@ -302,10 +281,10 @@
         <w:rPr/>
       </w:r>
     </w:p>
-    <w:p xmlns:wp14="http://schemas.microsoft.com/office/word/2010/wordml" wp14:textId="77777777">
-      <w:pPr>
-        <w:pStyle w:val="Normal"/>
-        <w:spacing w:before="0" w:after="0" w:line="240" w:lineRule="auto"/>
+    <w:p>
+      <w:pPr>
+        <w:pStyle w:val="Normal"/>
+        <w:spacing w:lineRule="auto" w:line="240" w:before="0" w:after="0"/>
         <w:jc w:val="right"/>
         <w:rPr/>
       </w:pPr>
@@ -313,10 +292,10 @@
         <w:rPr/>
       </w:r>
     </w:p>
-    <w:p xmlns:wp14="http://schemas.microsoft.com/office/word/2010/wordml" wp14:textId="77777777">
-      <w:pPr>
-        <w:pStyle w:val="Normal"/>
-        <w:spacing w:before="0" w:after="0" w:line="240" w:lineRule="auto"/>
+    <w:p>
+      <w:pPr>
+        <w:pStyle w:val="Normal"/>
+        <w:spacing w:lineRule="auto" w:line="240" w:before="0" w:after="0"/>
         <w:jc w:val="right"/>
         <w:rPr>
           <w:b/>
@@ -329,16 +308,16 @@
         </w:rPr>
       </w:r>
     </w:p>
-    <w:p xmlns:wp14="http://schemas.microsoft.com/office/word/2010/wordml" wp14:textId="77777777">
+    <w:p>
       <w:pPr>
         <w:pStyle w:val="Normal"/>
         <w:pBdr>
-          <w:top w:val="single" w:color="000000" w:sz="4" w:space="1"/>
-          <w:left w:val="single" w:color="000000" w:sz="4" w:space="4"/>
-          <w:bottom w:val="single" w:color="000000" w:sz="4" w:space="1"/>
-          <w:right w:val="single" w:color="000000" w:sz="4" w:space="4"/>
+          <w:top w:val="single" w:sz="4" w:space="1" w:color="000000"/>
+          <w:left w:val="single" w:sz="4" w:space="4" w:color="000000"/>
+          <w:bottom w:val="single" w:sz="4" w:space="1" w:color="000000"/>
+          <w:right w:val="single" w:sz="4" w:space="4" w:color="000000"/>
         </w:pBdr>
-        <w:spacing w:before="0" w:after="0" w:line="240" w:lineRule="auto"/>
+        <w:spacing w:lineRule="auto" w:line="240" w:before="0" w:after="0"/>
         <w:jc w:val="both"/>
         <w:rPr>
           <w:b/>
@@ -351,16 +330,16 @@
         </w:rPr>
       </w:r>
     </w:p>
-    <w:p xmlns:wp14="http://schemas.microsoft.com/office/word/2010/wordml" wp14:textId="77777777">
+    <w:p>
       <w:pPr>
         <w:pStyle w:val="Normal"/>
         <w:pBdr>
-          <w:top w:val="single" w:color="000000" w:sz="4" w:space="1"/>
-          <w:left w:val="single" w:color="000000" w:sz="4" w:space="4"/>
-          <w:bottom w:val="single" w:color="000000" w:sz="4" w:space="1"/>
-          <w:right w:val="single" w:color="000000" w:sz="4" w:space="4"/>
+          <w:top w:val="single" w:sz="4" w:space="1" w:color="000000"/>
+          <w:left w:val="single" w:sz="4" w:space="4" w:color="000000"/>
+          <w:bottom w:val="single" w:sz="4" w:space="1" w:color="000000"/>
+          <w:right w:val="single" w:sz="4" w:space="4" w:color="000000"/>
         </w:pBdr>
-        <w:spacing w:before="0" w:after="0" w:line="240" w:lineRule="auto"/>
+        <w:spacing w:lineRule="auto" w:line="240" w:before="0" w:after="0"/>
         <w:jc w:val="both"/>
         <w:rPr>
           <w:b/>
@@ -374,16 +353,16 @@
         <w:t>Adresse de la location :</w:t>
       </w:r>
     </w:p>
-    <w:p xmlns:wp14="http://schemas.microsoft.com/office/word/2010/wordml" wp14:textId="77777777">
+    <w:p>
       <w:pPr>
         <w:pStyle w:val="Normal"/>
         <w:pBdr>
-          <w:top w:val="single" w:color="000000" w:sz="4" w:space="1"/>
-          <w:left w:val="single" w:color="000000" w:sz="4" w:space="4"/>
-          <w:bottom w:val="single" w:color="000000" w:sz="4" w:space="1"/>
-          <w:right w:val="single" w:color="000000" w:sz="4" w:space="4"/>
+          <w:top w:val="single" w:sz="4" w:space="1" w:color="000000"/>
+          <w:left w:val="single" w:sz="4" w:space="4" w:color="000000"/>
+          <w:bottom w:val="single" w:sz="4" w:space="1" w:color="000000"/>
+          <w:right w:val="single" w:sz="4" w:space="4" w:color="000000"/>
         </w:pBdr>
-        <w:spacing w:before="0" w:after="0" w:line="240" w:lineRule="auto"/>
+        <w:spacing w:lineRule="auto" w:line="240" w:before="0" w:after="0"/>
         <w:jc w:val="both"/>
         <w:rPr>
           <w:b/>
@@ -396,16 +375,16 @@
         </w:rPr>
       </w:r>
     </w:p>
-    <w:p xmlns:wp14="http://schemas.microsoft.com/office/word/2010/wordml" wp14:textId="77777777">
+    <w:p>
       <w:pPr>
         <w:pStyle w:val="Normal"/>
         <w:pBdr>
-          <w:top w:val="single" w:color="000000" w:sz="4" w:space="1"/>
-          <w:left w:val="single" w:color="000000" w:sz="4" w:space="4"/>
-          <w:bottom w:val="single" w:color="000000" w:sz="4" w:space="1"/>
-          <w:right w:val="single" w:color="000000" w:sz="4" w:space="4"/>
+          <w:top w:val="single" w:sz="4" w:space="1" w:color="000000"/>
+          <w:left w:val="single" w:sz="4" w:space="4" w:color="000000"/>
+          <w:bottom w:val="single" w:sz="4" w:space="1" w:color="000000"/>
+          <w:right w:val="single" w:sz="4" w:space="4" w:color="000000"/>
         </w:pBdr>
-        <w:spacing w:before="0" w:after="0" w:line="240" w:lineRule="auto"/>
+        <w:spacing w:lineRule="auto" w:line="240" w:before="0" w:after="0"/>
         <w:jc w:val="both"/>
         <w:rPr/>
       </w:pPr>
@@ -414,16 +393,16 @@
         <w:t>{adresse_locataire}</w:t>
       </w:r>
     </w:p>
-    <w:p xmlns:wp14="http://schemas.microsoft.com/office/word/2010/wordml" wp14:textId="77777777">
+    <w:p>
       <w:pPr>
         <w:pStyle w:val="Normal"/>
         <w:pBdr>
-          <w:top w:val="single" w:color="000000" w:sz="4" w:space="1"/>
-          <w:left w:val="single" w:color="000000" w:sz="4" w:space="4"/>
-          <w:bottom w:val="single" w:color="000000" w:sz="4" w:space="1"/>
-          <w:right w:val="single" w:color="000000" w:sz="4" w:space="4"/>
+          <w:top w:val="single" w:sz="4" w:space="1" w:color="000000"/>
+          <w:left w:val="single" w:sz="4" w:space="4" w:color="000000"/>
+          <w:bottom w:val="single" w:sz="4" w:space="1" w:color="000000"/>
+          <w:right w:val="single" w:sz="4" w:space="4" w:color="000000"/>
         </w:pBdr>
-        <w:spacing w:before="0" w:after="0" w:line="240" w:lineRule="auto"/>
+        <w:spacing w:lineRule="auto" w:line="240" w:before="0" w:after="0"/>
         <w:jc w:val="both"/>
         <w:rPr/>
       </w:pPr>
@@ -432,16 +411,16 @@
         <w:t>{cp_ville_location}</w:t>
       </w:r>
     </w:p>
-    <w:p xmlns:wp14="http://schemas.microsoft.com/office/word/2010/wordml" wp14:textId="77777777">
+    <w:p>
       <w:pPr>
         <w:pStyle w:val="Normal"/>
         <w:pBdr>
-          <w:top w:val="single" w:color="000000" w:sz="4" w:space="1"/>
-          <w:left w:val="single" w:color="000000" w:sz="4" w:space="4"/>
-          <w:bottom w:val="single" w:color="000000" w:sz="4" w:space="1"/>
-          <w:right w:val="single" w:color="000000" w:sz="4" w:space="4"/>
+          <w:top w:val="single" w:sz="4" w:space="1" w:color="000000"/>
+          <w:left w:val="single" w:sz="4" w:space="4" w:color="000000"/>
+          <w:bottom w:val="single" w:sz="4" w:space="1" w:color="000000"/>
+          <w:right w:val="single" w:sz="4" w:space="4" w:color="000000"/>
         </w:pBdr>
-        <w:spacing w:before="0" w:after="0" w:line="240" w:lineRule="auto"/>
+        <w:spacing w:lineRule="auto" w:line="240" w:before="0" w:after="0"/>
         <w:jc w:val="both"/>
         <w:rPr/>
       </w:pPr>
@@ -449,16 +428,16 @@
         <w:rPr/>
       </w:r>
     </w:p>
-    <w:p xmlns:wp14="http://schemas.microsoft.com/office/word/2010/wordml" wp14:textId="77777777">
+    <w:p>
       <w:pPr>
         <w:pStyle w:val="Normal"/>
         <w:pBdr>
-          <w:top w:val="single" w:color="000000" w:sz="4" w:space="1"/>
-          <w:left w:val="single" w:color="000000" w:sz="4" w:space="4"/>
-          <w:bottom w:val="single" w:color="000000" w:sz="4" w:space="1"/>
-          <w:right w:val="single" w:color="000000" w:sz="4" w:space="4"/>
+          <w:top w:val="single" w:sz="4" w:space="1" w:color="000000"/>
+          <w:left w:val="single" w:sz="4" w:space="4" w:color="000000"/>
+          <w:bottom w:val="single" w:sz="4" w:space="1" w:color="000000"/>
+          <w:right w:val="single" w:sz="4" w:space="4" w:color="000000"/>
         </w:pBdr>
-        <w:spacing w:before="0" w:after="0" w:line="240" w:lineRule="auto"/>
+        <w:spacing w:lineRule="auto" w:line="240" w:before="0" w:after="0"/>
         <w:jc w:val="both"/>
         <w:rPr/>
       </w:pPr>
@@ -466,10 +445,10 @@
         <w:rPr/>
       </w:r>
     </w:p>
-    <w:p xmlns:wp14="http://schemas.microsoft.com/office/word/2010/wordml" wp14:textId="77777777">
-      <w:pPr>
-        <w:pStyle w:val="Normal"/>
-        <w:spacing w:before="0" w:after="0" w:line="240" w:lineRule="auto"/>
+    <w:p>
+      <w:pPr>
+        <w:pStyle w:val="Normal"/>
+        <w:spacing w:lineRule="auto" w:line="240" w:before="0" w:after="0"/>
         <w:jc w:val="both"/>
         <w:rPr/>
       </w:pPr>
@@ -477,10 +456,10 @@
         <w:rPr/>
       </w:r>
     </w:p>
-    <w:p xmlns:wp14="http://schemas.microsoft.com/office/word/2010/wordml" wp14:textId="77777777">
-      <w:pPr>
-        <w:pStyle w:val="Normal"/>
-        <w:spacing w:before="0" w:after="0" w:line="240" w:lineRule="auto"/>
+    <w:p>
+      <w:pPr>
+        <w:pStyle w:val="Normal"/>
+        <w:spacing w:lineRule="auto" w:line="240" w:before="0" w:after="0"/>
         <w:jc w:val="both"/>
         <w:rPr/>
       </w:pPr>
@@ -488,10 +467,10 @@
         <w:rPr/>
       </w:r>
     </w:p>
-    <w:p xmlns:wp14="http://schemas.microsoft.com/office/word/2010/wordml" wp14:textId="77777777">
-      <w:pPr>
-        <w:pStyle w:val="Normal"/>
-        <w:spacing w:before="0" w:after="0" w:line="240" w:lineRule="auto"/>
+    <w:p>
+      <w:pPr>
+        <w:pStyle w:val="Normal"/>
+        <w:spacing w:lineRule="auto" w:line="240" w:before="0" w:after="0"/>
         <w:jc w:val="both"/>
         <w:rPr/>
       </w:pPr>
@@ -511,13 +490,13 @@
           <w:bottom w:w="0" w:type="dxa"/>
           <w:right w:w="108" w:type="dxa"/>
         </w:tblCellMar>
-        <w:tblLook w:val="0100" w:firstRow="0" w:lastRow="0" w:firstColumn="0" w:lastColumn="1" w:noHBand="0" w:noVBand="0"/>
+        <w:tblLook w:val="0100" w:noHBand="0" w:noVBand="0" w:firstColumn="0" w:lastRow="0" w:lastColumn="1" w:firstRow="0"/>
       </w:tblPr>
       <w:tblGrid>
         <w:gridCol w:w="6996"/>
         <w:gridCol w:w="2526"/>
       </w:tblGrid>
-      <w:tr xmlns:wp14="http://schemas.microsoft.com/office/word/2010/wordml" wp14:textId="77777777">
+      <w:tr>
         <w:trPr>
           <w:trHeight w:val="567" w:hRule="atLeast"/>
         </w:trPr>
@@ -525,15 +504,14 @@
           <w:tcPr>
             <w:tcW w:w="6996" w:type="dxa"/>
             <w:tcBorders>
-              <w:top w:val="single" w:color="000000" w:themeColor="text1" w:sz="4" w:space="0"/>
-              <w:left w:val="single" w:color="000000" w:themeColor="text1" w:sz="4" w:space="0"/>
-              <w:bottom w:val="single" w:color="000000" w:themeColor="text1" w:sz="4" w:space="0"/>
-              <w:right w:val="single" w:color="000000" w:themeColor="text1" w:sz="4" w:space="0"/>
+              <w:top w:val="single" w:sz="4" w:space="0" w:color="000000"/>
+              <w:left w:val="single" w:sz="4" w:space="0" w:color="000000"/>
+              <w:bottom w:val="single" w:sz="4" w:space="0" w:color="000000"/>
+              <w:right w:val="single" w:sz="4" w:space="0" w:color="000000"/>
             </w:tcBorders>
-            <w:shd w:val="clear" w:color="auto" w:fill="BFBFBF" w:themeFill="background1" w:themeFillShade="BF"/>
-            <w:tcMar/>
+            <w:shd w:color="auto" w:fill="BFBFBF" w:themeFill="background1" w:themeFillShade="bf" w:val="clear"/>
           </w:tcPr>
-          <w:p wp14:textId="77777777">
+          <w:p>
             <w:pPr>
               <w:pStyle w:val="Normal"/>
               <w:widowControl w:val="false"/>
@@ -544,6 +522,17 @@
               </w:rPr>
             </w:pPr>
             <w:r>
+              <w:rPr/>
+            </w:r>
+          </w:p>
+          <w:p>
+            <w:pPr>
+              <w:pStyle w:val="Normal"/>
+              <w:widowControl w:val="false"/>
+              <w:spacing w:before="0" w:after="160"/>
+              <w:rPr/>
+            </w:pPr>
+            <w:r>
               <w:rPr>
                 <w:b/>
               </w:rPr>
@@ -555,15 +544,14 @@
           <w:tcPr>
             <w:tcW w:w="2526" w:type="dxa"/>
             <w:tcBorders>
-              <w:top w:val="single" w:color="000000" w:themeColor="text1" w:sz="4" w:space="0"/>
-              <w:left w:val="single" w:color="000000" w:themeColor="text1" w:sz="4" w:space="0"/>
-              <w:bottom w:val="single" w:color="000000" w:themeColor="text1" w:sz="4" w:space="0"/>
-              <w:right w:val="single" w:color="000000" w:themeColor="text1" w:sz="4" w:space="0"/>
+              <w:top w:val="single" w:sz="4" w:space="0" w:color="000000"/>
+              <w:left w:val="single" w:sz="4" w:space="0" w:color="000000"/>
+              <w:bottom w:val="single" w:sz="4" w:space="0" w:color="000000"/>
+              <w:right w:val="single" w:sz="4" w:space="0" w:color="000000"/>
             </w:tcBorders>
-            <w:shd w:val="clear" w:color="auto" w:fill="BFBFBF" w:themeFill="background1" w:themeFillShade="BF"/>
-            <w:tcMar/>
+            <w:shd w:color="auto" w:fill="BFBFBF" w:themeFill="background1" w:themeFillShade="bf" w:val="clear"/>
           </w:tcPr>
-          <w:p wp14:textId="77777777">
+          <w:p>
             <w:pPr>
               <w:pStyle w:val="Normal"/>
               <w:widowControl w:val="false"/>
@@ -576,14 +564,42 @@
             </w:pPr>
             <w:r>
               <w:rPr>
+                <w:rFonts w:eastAsia="Calibri" w:cs="Calibri"/>
+                <w:color w:val="auto"/>
+                <w:kern w:val="0"/>
+                <w:sz w:val="22"/>
+                <w:szCs w:val="22"/>
+                <w:lang w:val="fr-FR" w:eastAsia="fr-FR" w:bidi="ar-SA"/>
+              </w:rPr>
+            </w:r>
+          </w:p>
+          <w:p>
+            <w:pPr>
+              <w:pStyle w:val="Normal"/>
+              <w:widowControl w:val="false"/>
+              <w:spacing w:before="0" w:after="160"/>
+              <w:jc w:val="center"/>
+              <w:rPr>
                 <w:b/>
+                <w:b/>
+              </w:rPr>
+            </w:pPr>
+            <w:r>
+              <w:rPr>
+                <w:rFonts w:eastAsia="Calibri" w:cs="Calibri"/>
+                <w:b/>
+                <w:color w:val="auto"/>
+                <w:kern w:val="0"/>
+                <w:sz w:val="22"/>
+                <w:szCs w:val="22"/>
+                <w:lang w:val="fr-FR" w:eastAsia="fr-FR" w:bidi="ar-SA"/>
               </w:rPr>
               <w:t>MONTANT</w:t>
             </w:r>
           </w:p>
         </w:tc>
       </w:tr>
-      <w:tr xmlns:wp14="http://schemas.microsoft.com/office/word/2010/wordml" wp14:textId="77777777">
+      <w:tr>
         <w:trPr>
           <w:trHeight w:val="567" w:hRule="atLeast"/>
         </w:trPr>
@@ -591,22 +607,21 @@
           <w:tcPr>
             <w:tcW w:w="6996" w:type="dxa"/>
             <w:tcBorders>
-              <w:top w:val="single" w:color="000000" w:themeColor="text1" w:sz="4" w:space="0"/>
-              <w:left w:val="single" w:color="000000" w:themeColor="text1" w:sz="4" w:space="0"/>
-              <w:bottom w:val="single" w:color="000000" w:themeColor="text1" w:sz="4" w:space="0"/>
-              <w:right w:val="single" w:color="000000" w:themeColor="text1" w:sz="4" w:space="0"/>
+              <w:top w:val="single" w:sz="4" w:space="0" w:color="000000"/>
+              <w:left w:val="single" w:sz="4" w:space="0" w:color="000000"/>
+              <w:bottom w:val="single" w:sz="4" w:space="0" w:color="000000"/>
+              <w:right w:val="single" w:sz="4" w:space="0" w:color="000000"/>
             </w:tcBorders>
-            <w:tcMar/>
           </w:tcPr>
-          <w:p wp14:textId="77777777">
+          <w:p>
             <w:pPr>
               <w:pStyle w:val="Normal"/>
-              <w:widowControl w:val="0"/>
-              <w:suppressLineNumbers w:val="0"/>
+              <w:widowControl w:val="false"/>
               <w:bidi w:val="0"/>
-              <w:spacing w:before="120" w:beforeAutospacing="off" w:after="240" w:afterAutospacing="off" w:line="259" w:lineRule="auto"/>
-              <w:ind w:left="0" w:right="0"/>
+              <w:spacing w:lineRule="auto" w:line="259" w:beforeAutospacing="0" w:before="120" w:afterAutospacing="0" w:after="240"/>
+              <w:ind w:left="0" w:right="0" w:hanging="0"/>
               <w:jc w:val="left"/>
+              <w:rPr/>
             </w:pPr>
             <w:r>
               <w:rPr/>
@@ -618,40 +633,28 @@
           <w:tcPr>
             <w:tcW w:w="2526" w:type="dxa"/>
             <w:tcBorders>
-              <w:top w:val="single" w:color="000000" w:themeColor="text1" w:sz="4" w:space="0"/>
-              <w:left w:val="single" w:color="000000" w:themeColor="text1" w:sz="4" w:space="0"/>
-              <w:bottom w:val="single" w:color="000000" w:themeColor="text1" w:sz="4" w:space="0"/>
-              <w:right w:val="single" w:color="000000" w:themeColor="text1" w:sz="4" w:space="0"/>
+              <w:top w:val="single" w:sz="4" w:space="0" w:color="000000"/>
+              <w:left w:val="single" w:sz="4" w:space="0" w:color="000000"/>
+              <w:bottom w:val="single" w:sz="4" w:space="0" w:color="000000"/>
+              <w:right w:val="single" w:sz="4" w:space="0" w:color="000000"/>
             </w:tcBorders>
-            <w:tcMar/>
           </w:tcPr>
-          <w:p wp14:textId="185EA1B2">
+          <w:p>
             <w:pPr>
               <w:pStyle w:val="Normal"/>
-              <w:widowControl w:val="0"/>
-              <w:spacing w:before="120" w:beforeAutospacing="off" w:after="240" w:afterAutospacing="off"/>
+              <w:widowControl w:val="false"/>
+              <w:spacing w:beforeAutospacing="0" w:before="120" w:afterAutospacing="0" w:after="240"/>
               <w:jc w:val="center"/>
+              <w:rPr/>
             </w:pPr>
             <w:r>
               <w:rPr/>
-              <w:t>{</w:t>
-            </w:r>
-            <w:r>
-              <w:rPr/>
-              <w:t>price_no_charge</w:t>
-            </w:r>
-            <w:r>
-              <w:rPr/>
-              <w:t>}</w:t>
-            </w:r>
-            <w:r>
-              <w:rPr/>
-              <w:t xml:space="preserve"> €</w:t>
+              <w:t>{price_no_charge} €</w:t>
             </w:r>
           </w:p>
         </w:tc>
       </w:tr>
-      <w:tr xmlns:wp14="http://schemas.microsoft.com/office/word/2010/wordml" wp14:textId="77777777">
+      <w:tr>
         <w:trPr>
           <w:trHeight w:val="593" w:hRule="atLeast"/>
         </w:trPr>
@@ -659,22 +662,21 @@
           <w:tcPr>
             <w:tcW w:w="6996" w:type="dxa"/>
             <w:tcBorders>
-              <w:top w:val="single" w:color="000000" w:themeColor="text1" w:sz="4" w:space="0"/>
-              <w:left w:val="single" w:color="000000" w:themeColor="text1" w:sz="4" w:space="0"/>
-              <w:bottom w:val="single" w:color="000000" w:themeColor="text1" w:sz="4" w:space="0"/>
-              <w:right w:val="single" w:color="000000" w:themeColor="text1" w:sz="4" w:space="0"/>
+              <w:top w:val="single" w:sz="4" w:space="0" w:color="000000"/>
+              <w:left w:val="single" w:sz="4" w:space="0" w:color="000000"/>
+              <w:bottom w:val="single" w:sz="4" w:space="0" w:color="000000"/>
+              <w:right w:val="single" w:sz="4" w:space="0" w:color="000000"/>
             </w:tcBorders>
-            <w:tcMar/>
           </w:tcPr>
-          <w:p wp14:textId="77777777">
+          <w:p>
             <w:pPr>
               <w:pStyle w:val="Normal"/>
-              <w:widowControl w:val="0"/>
-              <w:suppressLineNumbers w:val="0"/>
+              <w:widowControl w:val="false"/>
               <w:bidi w:val="0"/>
-              <w:spacing w:before="120" w:beforeAutospacing="off" w:after="240" w:afterAutospacing="off" w:line="259" w:lineRule="auto"/>
-              <w:ind w:left="0" w:right="0"/>
+              <w:spacing w:lineRule="auto" w:line="259" w:beforeAutospacing="0" w:before="120" w:afterAutospacing="0" w:after="240"/>
+              <w:ind w:left="0" w:right="0" w:hanging="0"/>
               <w:jc w:val="left"/>
+              <w:rPr/>
             </w:pPr>
             <w:r>
               <w:rPr/>
@@ -686,35 +688,30 @@
           <w:tcPr>
             <w:tcW w:w="2526" w:type="dxa"/>
             <w:tcBorders>
-              <w:top w:val="single" w:color="000000" w:themeColor="text1" w:sz="4" w:space="0"/>
-              <w:left w:val="single" w:color="000000" w:themeColor="text1" w:sz="4" w:space="0"/>
-              <w:bottom w:val="single" w:color="000000" w:themeColor="text1" w:sz="4" w:space="0"/>
-              <w:right w:val="single" w:color="000000" w:themeColor="text1" w:sz="4" w:space="0"/>
+              <w:top w:val="single" w:sz="4" w:space="0" w:color="000000"/>
+              <w:left w:val="single" w:sz="4" w:space="0" w:color="000000"/>
+              <w:bottom w:val="single" w:sz="4" w:space="0" w:color="000000"/>
+              <w:right w:val="single" w:sz="4" w:space="0" w:color="000000"/>
             </w:tcBorders>
-            <w:tcMar/>
           </w:tcPr>
-          <w:p wp14:textId="77777777">
+          <w:p>
             <w:pPr>
               <w:pStyle w:val="Normal"/>
-              <w:widowControl w:val="0"/>
-              <w:suppressLineNumbers w:val="0"/>
+              <w:widowControl w:val="false"/>
               <w:bidi w:val="0"/>
-              <w:spacing w:before="120" w:beforeAutospacing="off" w:after="240" w:afterAutospacing="off" w:line="259" w:lineRule="auto"/>
-              <w:ind w:left="0" w:right="0"/>
+              <w:spacing w:lineRule="auto" w:line="259" w:beforeAutospacing="0" w:before="120" w:afterAutospacing="0" w:after="240"/>
+              <w:ind w:left="0" w:right="0" w:hanging="0"/>
               <w:jc w:val="center"/>
+              <w:rPr/>
             </w:pPr>
             <w:r>
               <w:rPr/>
-              <w:t>{charge_price}</w:t>
-            </w:r>
-            <w:r>
-              <w:rPr/>
-              <w:t xml:space="preserve"> €</w:t>
+              <w:t>{charge_price} €</w:t>
             </w:r>
           </w:p>
         </w:tc>
       </w:tr>
-      <w:tr xmlns:wp14="http://schemas.microsoft.com/office/word/2010/wordml" wp14:textId="77777777">
+      <w:tr>
         <w:trPr>
           <w:trHeight w:val="567" w:hRule="atLeast"/>
         </w:trPr>
@@ -722,22 +719,21 @@
           <w:tcPr>
             <w:tcW w:w="6996" w:type="dxa"/>
             <w:tcBorders>
-              <w:top w:val="single" w:color="000000" w:themeColor="text1" w:sz="4" w:space="0"/>
-              <w:left w:val="single" w:color="000000" w:themeColor="text1" w:sz="4" w:space="0"/>
-              <w:bottom w:val="single" w:color="000000" w:themeColor="text1" w:sz="4" w:space="0"/>
-              <w:right w:val="single" w:color="000000" w:themeColor="text1" w:sz="4" w:space="0"/>
+              <w:top w:val="single" w:sz="4" w:space="0" w:color="000000"/>
+              <w:left w:val="single" w:sz="4" w:space="0" w:color="000000"/>
+              <w:bottom w:val="single" w:sz="4" w:space="0" w:color="000000"/>
+              <w:right w:val="single" w:sz="4" w:space="0" w:color="000000"/>
             </w:tcBorders>
-            <w:tcMar/>
           </w:tcPr>
-          <w:p wp14:textId="77777777">
+          <w:p>
             <w:pPr>
               <w:pStyle w:val="Normal"/>
-              <w:widowControl w:val="0"/>
-              <w:suppressLineNumbers w:val="0"/>
+              <w:widowControl w:val="false"/>
               <w:bidi w:val="0"/>
-              <w:spacing w:before="120" w:beforeAutospacing="off" w:after="240" w:afterAutospacing="off" w:line="259" w:lineRule="auto"/>
-              <w:ind w:left="0" w:right="0"/>
+              <w:spacing w:lineRule="auto" w:line="259" w:beforeAutospacing="0" w:before="120" w:afterAutospacing="0" w:after="240"/>
+              <w:ind w:left="0" w:right="0" w:hanging="0"/>
               <w:jc w:val="left"/>
+              <w:rPr/>
             </w:pPr>
             <w:r>
               <w:rPr/>
@@ -749,22 +745,21 @@
           <w:tcPr>
             <w:tcW w:w="2526" w:type="dxa"/>
             <w:tcBorders>
-              <w:top w:val="single" w:color="000000" w:themeColor="text1" w:sz="4" w:space="0"/>
-              <w:left w:val="single" w:color="000000" w:themeColor="text1" w:sz="4" w:space="0"/>
-              <w:bottom w:val="single" w:color="000000" w:themeColor="text1" w:sz="4" w:space="0"/>
-              <w:right w:val="single" w:color="000000" w:themeColor="text1" w:sz="4" w:space="0"/>
+              <w:top w:val="single" w:sz="4" w:space="0" w:color="000000"/>
+              <w:left w:val="single" w:sz="4" w:space="0" w:color="000000"/>
+              <w:bottom w:val="single" w:sz="4" w:space="0" w:color="000000"/>
+              <w:right w:val="single" w:sz="4" w:space="0" w:color="000000"/>
             </w:tcBorders>
-            <w:tcMar/>
           </w:tcPr>
-          <w:p wp14:textId="77777777">
+          <w:p>
             <w:pPr>
               <w:pStyle w:val="Normal"/>
-              <w:widowControl w:val="0"/>
-              <w:suppressLineNumbers w:val="0"/>
+              <w:widowControl w:val="false"/>
               <w:bidi w:val="0"/>
-              <w:spacing w:before="120" w:beforeAutospacing="off" w:after="240" w:afterAutospacing="off" w:line="259" w:lineRule="auto"/>
-              <w:ind w:left="0" w:right="0"/>
+              <w:spacing w:lineRule="auto" w:line="259" w:beforeAutospacing="0" w:before="120" w:afterAutospacing="0" w:after="240"/>
+              <w:ind w:left="0" w:right="0" w:hanging="0"/>
               <w:jc w:val="center"/>
+              <w:rPr/>
             </w:pPr>
             <w:r>
               <w:rPr/>
@@ -774,10 +769,10 @@
         </w:tc>
       </w:tr>
     </w:tbl>
-    <w:p xmlns:wp14="http://schemas.microsoft.com/office/word/2010/wordml" wp14:textId="77777777">
-      <w:pPr>
-        <w:pStyle w:val="Normal"/>
-        <w:spacing w:before="0" w:after="0" w:line="240" w:lineRule="auto"/>
+    <w:p>
+      <w:pPr>
+        <w:pStyle w:val="Normal"/>
+        <w:spacing w:lineRule="auto" w:line="240" w:before="0" w:after="0"/>
         <w:jc w:val="right"/>
         <w:rPr/>
       </w:pPr>
@@ -785,10 +780,10 @@
         <w:rPr/>
       </w:r>
     </w:p>
-    <w:p xmlns:wp14="http://schemas.microsoft.com/office/word/2010/wordml" wp14:textId="77777777">
-      <w:pPr>
-        <w:pStyle w:val="Normal"/>
-        <w:spacing w:before="0" w:after="0" w:line="240" w:lineRule="auto"/>
+    <w:p>
+      <w:pPr>
+        <w:pStyle w:val="Normal"/>
+        <w:spacing w:lineRule="auto" w:line="240" w:before="0" w:after="0"/>
         <w:jc w:val="right"/>
         <w:rPr/>
       </w:pPr>
@@ -796,27 +791,21 @@
         <w:rPr/>
       </w:r>
     </w:p>
-    <w:p xmlns:wp14="http://schemas.microsoft.com/office/word/2010/wordml" wp14:textId="77777777">
-      <w:pPr>
-        <w:pStyle w:val="Normal"/>
-        <w:spacing w:before="0" w:after="0" w:line="240" w:lineRule="auto"/>
+    <w:p>
+      <w:pPr>
+        <w:pStyle w:val="Normal"/>
+        <w:spacing w:lineRule="auto" w:line="240" w:before="0" w:after="0"/>
         <w:rPr/>
       </w:pPr>
       <w:r>
         <w:rPr/>
         <w:t>Date de paiement : {date_paiement}</w:t>
       </w:r>
-      <w:r>
-        <w:rPr/>
-      </w:r>
-      <w:r>
-        <w:rPr/>
-      </w:r>
-    </w:p>
-    <w:p xmlns:wp14="http://schemas.microsoft.com/office/word/2010/wordml" wp14:textId="77777777">
-      <w:pPr>
-        <w:pStyle w:val="Normal"/>
-        <w:spacing w:before="0" w:after="0" w:line="240" w:lineRule="auto"/>
+    </w:p>
+    <w:p>
+      <w:pPr>
+        <w:pStyle w:val="Normal"/>
+        <w:spacing w:lineRule="auto" w:line="240" w:before="0" w:after="0"/>
         <w:rPr/>
       </w:pPr>
       <w:r>
@@ -824,26 +813,30 @@
         <w:t>Mode de paiement : Virement bancaire</w:t>
       </w:r>
     </w:p>
-    <w:p xmlns:wp14="http://schemas.microsoft.com/office/word/2010/wordml" wp14:textId="6C88AF09">
-      <w:pPr>
-        <w:pStyle w:val="Normal"/>
-        <w:spacing w:before="0" w:after="0" w:line="240" w:lineRule="auto"/>
-      </w:pPr>
-    </w:p>
-    <w:p xmlns:wp14="http://schemas.microsoft.com/office/word/2010/wordml" wp14:textId="77777777">
-      <w:pPr>
-        <w:pStyle w:val="Normal"/>
-        <w:spacing w:before="0" w:after="0" w:line="240" w:lineRule="auto"/>
-        <w:rPr/>
-      </w:pPr>
-      <w:r>
-        <w:rPr/>
-      </w:r>
-    </w:p>
-    <w:p xmlns:wp14="http://schemas.microsoft.com/office/word/2010/wordml" wp14:textId="77777777">
-      <w:pPr>
-        <w:pStyle w:val="Normal"/>
-        <w:spacing w:before="0" w:after="0" w:line="240" w:lineRule="auto"/>
+    <w:p>
+      <w:pPr>
+        <w:pStyle w:val="Normal"/>
+        <w:spacing w:lineRule="auto" w:line="240" w:before="0" w:after="0"/>
+        <w:rPr/>
+      </w:pPr>
+      <w:r>
+        <w:rPr/>
+      </w:r>
+    </w:p>
+    <w:p>
+      <w:pPr>
+        <w:pStyle w:val="Normal"/>
+        <w:spacing w:lineRule="auto" w:line="240" w:before="0" w:after="0"/>
+        <w:rPr/>
+      </w:pPr>
+      <w:r>
+        <w:rPr/>
+      </w:r>
+    </w:p>
+    <w:p>
+      <w:pPr>
+        <w:pStyle w:val="Normal"/>
+        <w:spacing w:lineRule="auto" w:line="240" w:before="0" w:after="0"/>
         <w:jc w:val="right"/>
         <w:rPr/>
       </w:pPr>
@@ -852,221 +845,168 @@
         <w:t>S. BODIN</w:t>
       </w:r>
     </w:p>
-    <w:p xmlns:wp14="http://schemas.microsoft.com/office/word/2010/wordml" wp14:textId="77777777">
-      <w:pPr>
-        <w:pStyle w:val="Normal"/>
-        <w:spacing w:before="0" w:after="0" w:line="240" w:lineRule="auto"/>
+    <w:p>
+      <w:pPr>
+        <w:pStyle w:val="Normal"/>
+        <w:spacing w:lineRule="auto" w:line="240" w:before="0" w:after="0"/>
         <w:rPr>
           <w:highlight w:val="black"/>
         </w:rPr>
       </w:pPr>
       <w:r>
         <w:rPr/>
-        <mc:AlternateContent>
-          <mc:Choice Requires="wps">
-            <w:drawing>
-              <wp:anchor xmlns:wp14="http://schemas.microsoft.com/office/word/2010/wordprocessingDrawing" distT="0" distB="0" distL="114300" distR="114300" simplePos="0" relativeHeight="2" behindDoc="0" locked="0" layoutInCell="0" allowOverlap="1" wp14:anchorId="211F1682" wp14:editId="7777777">
-                <wp:simplePos x="0" y="0"/>
-                <wp:positionH relativeFrom="column">
-                  <wp:posOffset>4354830</wp:posOffset>
-                </wp:positionH>
-                <wp:positionV relativeFrom="paragraph">
-                  <wp:posOffset>149860</wp:posOffset>
-                </wp:positionV>
-                <wp:extent cx="847725" cy="394335"/>
-                <wp:effectExtent l="0" t="0" r="0" b="0"/>
-                <wp:wrapNone/>
-                <wp:docPr id="1" name="Encre 10"/>
-                <a:graphic xmlns:a="http://schemas.openxmlformats.org/drawingml/2006/main">
-                  <a:graphicData uri="http://schemas.openxmlformats.org/drawingml/2006/picture">
-                    <pic:pic xmlns:pic="http://schemas.openxmlformats.org/drawingml/2006/picture">
-                      <pic:nvPicPr>
-                        <pic:cNvPr id="0" name="Encre 10" descr=""/>
-                        <pic:cNvPicPr/>
-                      </pic:nvPicPr>
-                      <pic:blipFill>
-                        <a:blip r:embed="rId2"/>
-                        <a:stretch/>
-                      </pic:blipFill>
-                      <pic:spPr>
-                        <a:xfrm>
-                          <a:off x="0" y="0"/>
-                          <a:ext cx="847800" cy="394200"/>
-                        </a:xfrm>
-                        <a:prstGeom prst="rect">
-                          <a:avLst/>
-                        </a:prstGeom>
-                        <a:ln w="0">
-                          <a:noFill/>
-                        </a:ln>
-                      </pic:spPr>
-                    </pic:pic>
-                  </a:graphicData>
-                </a:graphic>
-              </wp:anchor>
-            </w:drawing>
-          </mc:Choice>
-          <mc:Fallback>
-            <w:pict w14:anchorId="36533124">
-              <v:shapetype id="_x0000_t75" coordsize="21600,21600" filled="f" stroked="f" o:spt="75" o:preferrelative="t" path="m@4@5l@4@11@9@11@9@5xe">
-                <v:stroke joinstyle="miter"/>
-                <v:formulas>
-                  <v:f eqn="if lineDrawn pixelLineWidth 0"/>
-                  <v:f eqn="sum @0 1 0"/>
-                  <v:f eqn="sum 0 0 @1"/>
-                  <v:f eqn="prod @2 1 2"/>
-                  <v:f eqn="prod @3 21600 pixelWidth"/>
-                  <v:f eqn="prod @3 21600 pixelHeight"/>
-                  <v:f eqn="sum @0 0 1"/>
-                  <v:f eqn="prod @6 1 2"/>
-                  <v:f eqn="prod @7 21600 pixelWidth"/>
-                  <v:f eqn="sum @8 21600 0"/>
-                  <v:f eqn="prod @7 21600 pixelHeight"/>
-                  <v:f eqn="sum @10 21600 0"/>
-                </v:formulas>
-                <v:path gradientshapeok="t" o:connecttype="rect" o:extrusionok="f"/>
-                <o:lock v:ext="edit" aspectratio="t"/>
-              </v:shapetype>
-              <v:shape id="shape_0" style="position:absolute;margin-left:342.9pt;margin-top:11.8pt;width:66.7pt;height:31pt;mso-wrap-style:none;v-text-anchor:middle" o:allowincell="f" stroked="f" type="_x0000_t75" ID="Encre 10">
-                <v:imagedata o:detectmouseclick="t" r:id="rId2"/>
-                <v:stroke color="#3465a4" joinstyle="round" endcap="flat"/>
-                <w10:wrap type="none"/>
-              </v:shape>
-            </w:pict>
-          </mc:Fallback>
-        </mc:AlternateContent>
-      </w:r>
-      <w:r>
-        <w:rPr/>
-        <mc:AlternateContent>
-          <mc:Choice Requires="wps">
-            <w:drawing>
-              <wp:anchor xmlns:wp14="http://schemas.microsoft.com/office/word/2010/wordprocessingDrawing" distT="0" distB="0" distL="114300" distR="114300" simplePos="0" relativeHeight="3" behindDoc="0" locked="0" layoutInCell="0" allowOverlap="1" wp14:anchorId="4C025E3F" wp14:editId="7777777">
-                <wp:simplePos x="0" y="0"/>
-                <wp:positionH relativeFrom="column">
-                  <wp:posOffset>5163820</wp:posOffset>
-                </wp:positionH>
-                <wp:positionV relativeFrom="paragraph">
-                  <wp:posOffset>297815</wp:posOffset>
-                </wp:positionV>
-                <wp:extent cx="145415" cy="80645"/>
-                <wp:effectExtent l="0" t="0" r="0" b="0"/>
-                <wp:wrapNone/>
-                <wp:docPr id="2" name="Encre 12"/>
-                <a:graphic xmlns:a="http://schemas.openxmlformats.org/drawingml/2006/main">
-                  <a:graphicData uri="http://schemas.openxmlformats.org/drawingml/2006/picture">
-                    <pic:pic xmlns:pic="http://schemas.openxmlformats.org/drawingml/2006/picture">
-                      <pic:nvPicPr>
-                        <pic:cNvPr id="1" name="Encre 12" descr=""/>
-                        <pic:cNvPicPr/>
-                      </pic:nvPicPr>
-                      <pic:blipFill>
-                        <a:blip r:embed="rId3"/>
-                        <a:stretch/>
-                      </pic:blipFill>
-                      <pic:spPr>
-                        <a:xfrm>
-                          <a:off x="0" y="0"/>
-                          <a:ext cx="145440" cy="80640"/>
-                        </a:xfrm>
-                        <a:prstGeom prst="rect">
-                          <a:avLst/>
-                        </a:prstGeom>
-                        <a:ln w="0">
-                          <a:noFill/>
-                        </a:ln>
-                      </pic:spPr>
-                    </pic:pic>
-                  </a:graphicData>
-                </a:graphic>
-              </wp:anchor>
-            </w:drawing>
-          </mc:Choice>
-          <mc:Fallback>
-            <w:pict w14:anchorId="5F44239C">
-              <v:shape id="shape_0" style="position:absolute;margin-left:406.6pt;margin-top:23.45pt;width:11.4pt;height:6.3pt;mso-wrap-style:none;v-text-anchor:middle" o:allowincell="f" stroked="f" type="_x0000_t75" ID="Encre 12">
-                <v:imagedata o:detectmouseclick="t" r:id="rId3"/>
-                <v:stroke color="#3465a4" joinstyle="round" endcap="flat"/>
-                <w10:wrap type="none"/>
-              </v:shape>
-            </w:pict>
-          </mc:Fallback>
-        </mc:AlternateContent>
-      </w:r>
-      <w:r>
-        <w:rPr/>
-        <mc:AlternateContent>
-          <mc:Choice Requires="wps">
-            <w:drawing>
-              <wp:anchor xmlns:wp14="http://schemas.microsoft.com/office/word/2010/wordprocessingDrawing" distT="0" distB="0" distL="114300" distR="114300" simplePos="0" relativeHeight="4" behindDoc="0" locked="0" layoutInCell="0" allowOverlap="1" wp14:anchorId="520706B0" wp14:editId="7777777">
-                <wp:simplePos x="0" y="0"/>
-                <wp:positionH relativeFrom="column">
-                  <wp:posOffset>5134610</wp:posOffset>
-                </wp:positionH>
-                <wp:positionV relativeFrom="paragraph">
-                  <wp:posOffset>278765</wp:posOffset>
-                </wp:positionV>
-                <wp:extent cx="13335" cy="13335"/>
-                <wp:effectExtent l="0" t="0" r="0" b="0"/>
-                <wp:wrapNone/>
-                <wp:docPr id="3" name="Encre 15"/>
-                <a:graphic xmlns:a="http://schemas.openxmlformats.org/drawingml/2006/main">
-                  <a:graphicData uri="http://schemas.openxmlformats.org/drawingml/2006/picture">
-                    <pic:pic xmlns:pic="http://schemas.openxmlformats.org/drawingml/2006/picture">
-                      <pic:nvPicPr>
-                        <pic:cNvPr id="2" name="Encre 15" descr=""/>
-                        <pic:cNvPicPr/>
-                      </pic:nvPicPr>
-                      <pic:blipFill>
-                        <a:blip r:embed="rId4"/>
-                        <a:stretch/>
-                      </pic:blipFill>
-                      <pic:spPr>
-                        <a:xfrm>
-                          <a:off x="0" y="0"/>
-                          <a:ext cx="13320" cy="13320"/>
-                        </a:xfrm>
-                        <a:prstGeom prst="rect">
-                          <a:avLst/>
-                        </a:prstGeom>
-                        <a:ln w="0">
-                          <a:noFill/>
-                        </a:ln>
-                      </pic:spPr>
-                    </pic:pic>
-                  </a:graphicData>
-                </a:graphic>
-              </wp:anchor>
-            </w:drawing>
-          </mc:Choice>
-          <mc:Fallback>
-            <w:pict w14:anchorId="3C53DD94">
-              <v:shape id="shape_0" style="position:absolute;margin-left:404.3pt;margin-top:21.95pt;width:1pt;height:1pt;mso-wrap-style:none;v-text-anchor:middle" o:allowincell="f" stroked="f" type="_x0000_t75" ID="Encre 15">
-                <v:imagedata o:detectmouseclick="t" r:id="rId4"/>
-                <v:stroke color="#3465a4" joinstyle="round" endcap="flat"/>
-                <w10:wrap type="none"/>
-              </v:shape>
-            </w:pict>
-          </mc:Fallback>
-        </mc:AlternateContent>
+        <w:drawing>
+          <wp:anchor behindDoc="0" distT="0" distB="0" distL="0" distR="0" simplePos="0" locked="0" layoutInCell="0" allowOverlap="1" relativeHeight="2">
+            <wp:simplePos x="0" y="0"/>
+            <wp:positionH relativeFrom="column">
+              <wp:posOffset>4354830</wp:posOffset>
+            </wp:positionH>
+            <wp:positionV relativeFrom="paragraph">
+              <wp:posOffset>149860</wp:posOffset>
+            </wp:positionV>
+            <wp:extent cx="847725" cy="394335"/>
+            <wp:effectExtent l="0" t="0" r="0" b="0"/>
+            <wp:wrapNone/>
+            <wp:docPr id="1" name="Encre 10" descr=""/>
+            <wp:cNvGraphicFramePr>
+              <a:graphicFrameLocks xmlns:a="http://schemas.openxmlformats.org/drawingml/2006/main" noChangeAspect="1"/>
+            </wp:cNvGraphicFramePr>
+            <a:graphic xmlns:a="http://schemas.openxmlformats.org/drawingml/2006/main">
+              <a:graphicData uri="http://schemas.openxmlformats.org/drawingml/2006/picture">
+                <pic:pic xmlns:pic="http://schemas.openxmlformats.org/drawingml/2006/picture">
+                  <pic:nvPicPr>
+                    <pic:cNvPr id="1" name="Encre 10" descr=""/>
+                    <pic:cNvPicPr>
+                      <a:picLocks noChangeAspect="1" noChangeArrowheads="1"/>
+                    </pic:cNvPicPr>
+                  </pic:nvPicPr>
+                  <pic:blipFill>
+                    <a:blip r:embed="rId2"/>
+                    <a:stretch>
+                      <a:fillRect/>
+                    </a:stretch>
+                  </pic:blipFill>
+                  <pic:spPr bwMode="auto">
+                    <a:xfrm>
+                      <a:off x="0" y="0"/>
+                      <a:ext cx="847725" cy="394335"/>
+                    </a:xfrm>
+                    <a:prstGeom prst="rect">
+                      <a:avLst/>
+                    </a:prstGeom>
+                  </pic:spPr>
+                </pic:pic>
+              </a:graphicData>
+            </a:graphic>
+          </wp:anchor>
+        </w:drawing>
+        <w:drawing>
+          <wp:anchor behindDoc="0" distT="0" distB="0" distL="0" distR="0" simplePos="0" locked="0" layoutInCell="0" allowOverlap="1" relativeHeight="3">
+            <wp:simplePos x="0" y="0"/>
+            <wp:positionH relativeFrom="column">
+              <wp:posOffset>5163820</wp:posOffset>
+            </wp:positionH>
+            <wp:positionV relativeFrom="paragraph">
+              <wp:posOffset>297815</wp:posOffset>
+            </wp:positionV>
+            <wp:extent cx="145415" cy="80645"/>
+            <wp:effectExtent l="0" t="0" r="0" b="0"/>
+            <wp:wrapNone/>
+            <wp:docPr id="2" name="Encre 12" descr=""/>
+            <wp:cNvGraphicFramePr>
+              <a:graphicFrameLocks xmlns:a="http://schemas.openxmlformats.org/drawingml/2006/main" noChangeAspect="1"/>
+            </wp:cNvGraphicFramePr>
+            <a:graphic xmlns:a="http://schemas.openxmlformats.org/drawingml/2006/main">
+              <a:graphicData uri="http://schemas.openxmlformats.org/drawingml/2006/picture">
+                <pic:pic xmlns:pic="http://schemas.openxmlformats.org/drawingml/2006/picture">
+                  <pic:nvPicPr>
+                    <pic:cNvPr id="2" name="Encre 12" descr=""/>
+                    <pic:cNvPicPr>
+                      <a:picLocks noChangeAspect="1" noChangeArrowheads="1"/>
+                    </pic:cNvPicPr>
+                  </pic:nvPicPr>
+                  <pic:blipFill>
+                    <a:blip r:embed="rId3"/>
+                    <a:stretch>
+                      <a:fillRect/>
+                    </a:stretch>
+                  </pic:blipFill>
+                  <pic:spPr bwMode="auto">
+                    <a:xfrm>
+                      <a:off x="0" y="0"/>
+                      <a:ext cx="145415" cy="80645"/>
+                    </a:xfrm>
+                    <a:prstGeom prst="rect">
+                      <a:avLst/>
+                    </a:prstGeom>
+                  </pic:spPr>
+                </pic:pic>
+              </a:graphicData>
+            </a:graphic>
+          </wp:anchor>
+        </w:drawing>
+        <w:drawing>
+          <wp:anchor behindDoc="0" distT="0" distB="0" distL="0" distR="0" simplePos="0" locked="0" layoutInCell="0" allowOverlap="1" relativeHeight="4">
+            <wp:simplePos x="0" y="0"/>
+            <wp:positionH relativeFrom="column">
+              <wp:posOffset>5134610</wp:posOffset>
+            </wp:positionH>
+            <wp:positionV relativeFrom="paragraph">
+              <wp:posOffset>278765</wp:posOffset>
+            </wp:positionV>
+            <wp:extent cx="13335" cy="13335"/>
+            <wp:effectExtent l="0" t="0" r="0" b="0"/>
+            <wp:wrapNone/>
+            <wp:docPr id="3" name="Encre 15" descr=""/>
+            <wp:cNvGraphicFramePr>
+              <a:graphicFrameLocks xmlns:a="http://schemas.openxmlformats.org/drawingml/2006/main" noChangeAspect="1"/>
+            </wp:cNvGraphicFramePr>
+            <a:graphic xmlns:a="http://schemas.openxmlformats.org/drawingml/2006/main">
+              <a:graphicData uri="http://schemas.openxmlformats.org/drawingml/2006/picture">
+                <pic:pic xmlns:pic="http://schemas.openxmlformats.org/drawingml/2006/picture">
+                  <pic:nvPicPr>
+                    <pic:cNvPr id="3" name="Encre 15" descr=""/>
+                    <pic:cNvPicPr>
+                      <a:picLocks noChangeAspect="1" noChangeArrowheads="1"/>
+                    </pic:cNvPicPr>
+                  </pic:nvPicPr>
+                  <pic:blipFill>
+                    <a:blip r:embed="rId4"/>
+                    <a:stretch>
+                      <a:fillRect/>
+                    </a:stretch>
+                  </pic:blipFill>
+                  <pic:spPr bwMode="auto">
+                    <a:xfrm>
+                      <a:off x="0" y="0"/>
+                      <a:ext cx="13335" cy="13335"/>
+                    </a:xfrm>
+                    <a:prstGeom prst="rect">
+                      <a:avLst/>
+                    </a:prstGeom>
+                  </pic:spPr>
+                </pic:pic>
+              </a:graphicData>
+            </a:graphic>
+          </wp:anchor>
+        </w:drawing>
       </w:r>
     </w:p>
     <w:sectPr>
       <w:type w:val="nextPage"/>
-      <w:pgSz w:w="11906" w:h="16838" w:orient="portrait"/>
-      <w:pgMar w:top="1417" w:right="1417" w:bottom="1417" w:left="1417" w:header="0" w:footer="0" w:gutter="0"/>
-      <w:pgNumType w:fmt="decimal" w:start="1"/>
+      <w:pgSz w:w="11906" w:h="16838"/>
+      <w:pgMar w:left="1417" w:right="1417" w:gutter="0" w:header="0" w:top="1417" w:footer="0" w:bottom="1417"/>
+      <w:pgNumType w:start="1" w:fmt="decimal"/>
       <w:formProt w:val="false"/>
       <w:textDirection w:val="lrTb"/>
       <w:docGrid w:type="default" w:linePitch="100" w:charSpace="4096"/>
-      <w:cols w:num="1"/>
     </w:sectPr>
   </w:body>
 </w:document>
 </file>
 
 <file path=word/styles.xml><?xml version="1.0" encoding="utf-8"?>
-<w:styles xmlns:wp14="http://schemas.microsoft.com/office/word/2010/wordprocessingDrawing" xmlns:w="http://schemas.openxmlformats.org/wordprocessingml/2006/main" xmlns:w14="http://schemas.microsoft.com/office/word/2010/wordml" xmlns:mc="http://schemas.openxmlformats.org/markup-compatibility/2006" mc:Ignorable="w14 wp14">
+<w:styles xmlns:w="http://schemas.openxmlformats.org/wordprocessingml/2006/main" xmlns:w14="http://schemas.microsoft.com/office/word/2010/wordml" xmlns:mc="http://schemas.openxmlformats.org/markup-compatibility/2006" mc:Ignorable="w14">
   <w:docDefaults>
     <w:rPrDefault>
       <w:rPr>
@@ -1465,8 +1405,9 @@
     <w:qFormat/>
     <w:pPr>
       <w:widowControl/>
+      <w:suppressAutoHyphens w:val="true"/>
       <w:bidi w:val="0"/>
-      <w:spacing w:before="0" w:after="160" w:line="259" w:lineRule="auto"/>
+      <w:spacing w:lineRule="auto" w:line="259" w:before="0" w:after="160"/>
       <w:jc w:val="left"/>
     </w:pPr>
     <w:rPr>
@@ -1479,7 +1420,7 @@
     </w:rPr>
   </w:style>
   <w:style w:type="paragraph" w:styleId="Heading1">
-    <w:name w:val="heading 1"/>
+    <w:name w:val="Heading 1"/>
     <w:basedOn w:val="Normal"/>
     <w:next w:val="Normal"/>
     <w:uiPriority w:val="9"/>
@@ -1497,7 +1438,7 @@
     </w:rPr>
   </w:style>
   <w:style w:type="paragraph" w:styleId="Heading2">
-    <w:name w:val="heading 2"/>
+    <w:name w:val="Heading 2"/>
     <w:basedOn w:val="Normal"/>
     <w:next w:val="Normal"/>
     <w:uiPriority w:val="9"/>
@@ -1517,7 +1458,7 @@
     </w:rPr>
   </w:style>
   <w:style w:type="paragraph" w:styleId="Heading3">
-    <w:name w:val="heading 3"/>
+    <w:name w:val="Heading 3"/>
     <w:basedOn w:val="Normal"/>
     <w:next w:val="Normal"/>
     <w:uiPriority w:val="9"/>
@@ -1537,7 +1478,7 @@
     </w:rPr>
   </w:style>
   <w:style w:type="paragraph" w:styleId="Heading4">
-    <w:name w:val="heading 4"/>
+    <w:name w:val="Heading 4"/>
     <w:basedOn w:val="Normal"/>
     <w:next w:val="Normal"/>
     <w:uiPriority w:val="9"/>
@@ -1557,7 +1498,7 @@
     </w:rPr>
   </w:style>
   <w:style w:type="paragraph" w:styleId="Heading5">
-    <w:name w:val="heading 5"/>
+    <w:name w:val="Heading 5"/>
     <w:basedOn w:val="Normal"/>
     <w:next w:val="Normal"/>
     <w:uiPriority w:val="9"/>
@@ -1575,7 +1516,7 @@
     </w:rPr>
   </w:style>
   <w:style w:type="paragraph" w:styleId="Heading6">
-    <w:name w:val="heading 6"/>
+    <w:name w:val="Heading 6"/>
     <w:basedOn w:val="Normal"/>
     <w:next w:val="Normal"/>
     <w:uiPriority w:val="9"/>
@@ -1621,7 +1562,7 @@
     <w:name w:val="Body Text"/>
     <w:basedOn w:val="Normal"/>
     <w:pPr>
-      <w:spacing w:before="0" w:after="140" w:line="276" w:lineRule="auto"/>
+      <w:spacing w:lineRule="auto" w:line="276" w:before="0" w:after="140"/>
     </w:pPr>
     <w:rPr/>
   </w:style>
@@ -1696,6 +1637,29 @@
       <w:szCs w:val="48"/>
     </w:rPr>
   </w:style>
+  <w:style w:type="paragraph" w:styleId="TableContents">
+    <w:name w:val="Table Contents"/>
+    <w:basedOn w:val="Normal"/>
+    <w:qFormat/>
+    <w:pPr>
+      <w:widowControl w:val="false"/>
+      <w:suppressLineNumbers/>
+    </w:pPr>
+    <w:rPr/>
+  </w:style>
+  <w:style w:type="paragraph" w:styleId="TableHeading">
+    <w:name w:val="Table Heading"/>
+    <w:basedOn w:val="TableContents"/>
+    <w:qFormat/>
+    <w:pPr>
+      <w:suppressLineNumbers/>
+      <w:jc w:val="center"/>
+    </w:pPr>
+    <w:rPr>
+      <w:b/>
+      <w:bCs/>
+    </w:rPr>
+  </w:style>
   <w:style w:type="numbering" w:styleId="NoList" w:default="1">
     <w:name w:val="No List"/>
     <w:uiPriority w:val="99"/>
@@ -1703,7 +1667,7 @@
     <w:unhideWhenUsed/>
     <w:qFormat/>
   </w:style>
-  <w:style w:type="table" w:styleId="TableauNormal" w:default="1">
+  <w:style w:type="table" w:default="1" w:styleId="TableauNormal">
     <w:name w:val="Normal Table"/>
     <w:uiPriority w:val="99"/>
     <w:semiHidden/>
@@ -1717,7 +1681,7 @@
       </w:tblCellMar>
     </w:tblPr>
   </w:style>
-  <w:style w:type="table" w:styleId="TableNormal" w:customStyle="1">
+  <w:style w:type="table" w:customStyle="1" w:styleId="TableNormal">
     <w:name w:val="Table Normal"/>
     <w:tblPr>
       <w:tblCellMar>

</xml_diff>

<commit_message>
feat: docx quittance correction
</commit_message>
<xml_diff>
--- a/src/assets/docx/Quittance_de_loyer.docx
+++ b/src/assets/docx/Quittance_de_loyer.docx
@@ -110,6 +110,7 @@
             </w:pPr>
             <w:r>
               <w:rPr/>
+              <w:t xml:space="preserve">{nom_bailleur} </w:t>
             </w:r>
           </w:p>
           <w:p>
@@ -120,7 +121,7 @@
             </w:pPr>
             <w:r>
               <w:rPr/>
-              <w:t xml:space="preserve">{nom_bailleur} {prenom_bailleur} </w:t>
+              <w:t>représenté par Sylvain BODIN</w:t>
             </w:r>
           </w:p>
           <w:p>
@@ -184,22 +185,6 @@
               <w:pStyle w:val="Normal"/>
               <w:widowControl w:val="false"/>
               <w:ind w:right="40" w:hanging="0"/>
-              <w:rPr>
-                <w:b/>
-                <w:b/>
-              </w:rPr>
-            </w:pPr>
-            <w:r>
-              <w:rPr>
-                <w:b/>
-              </w:rPr>
-            </w:r>
-          </w:p>
-          <w:p>
-            <w:pPr>
-              <w:pStyle w:val="Normal"/>
-              <w:widowControl w:val="false"/>
-              <w:ind w:right="40" w:hanging="0"/>
               <w:rPr/>
             </w:pPr>
             <w:r>
@@ -232,7 +217,7 @@
             </w:pPr>
             <w:r>
               <w:rPr/>
-              <w:t>{cp_ville_locataire}</w:t>
+              <w:t>69100 Villeurbanne</w:t>
             </w:r>
           </w:p>
         </w:tc>
@@ -268,17 +253,6 @@
       <w:r>
         <w:rPr/>
         <w:t>Fait à {ville_signature}, le {date_now}</w:t>
-      </w:r>
-    </w:p>
-    <w:p>
-      <w:pPr>
-        <w:pStyle w:val="Normal"/>
-        <w:spacing w:lineRule="auto" w:line="240" w:before="0" w:after="0"/>
-        <w:jc w:val="right"/>
-        <w:rPr/>
-      </w:pPr>
-      <w:r>
-        <w:rPr/>
       </w:r>
     </w:p>
     <w:p>
@@ -408,7 +382,7 @@
       </w:pPr>
       <w:r>
         <w:rPr/>
-        <w:t>{cp_ville_location}</w:t>
+        <w:t>69100 Villeurbanne</w:t>
       </w:r>
     </w:p>
     <w:p>
@@ -437,17 +411,6 @@
           <w:bottom w:val="single" w:sz="4" w:space="1" w:color="000000"/>
           <w:right w:val="single" w:sz="4" w:space="4" w:color="000000"/>
         </w:pBdr>
-        <w:spacing w:lineRule="auto" w:line="240" w:before="0" w:after="0"/>
-        <w:jc w:val="both"/>
-        <w:rPr/>
-      </w:pPr>
-      <w:r>
-        <w:rPr/>
-      </w:r>
-    </w:p>
-    <w:p>
-      <w:pPr>
-        <w:pStyle w:val="Normal"/>
         <w:spacing w:lineRule="auto" w:line="240" w:before="0" w:after="0"/>
         <w:jc w:val="both"/>
         <w:rPr/>
@@ -522,7 +485,9 @@
               </w:rPr>
             </w:pPr>
             <w:r>
-              <w:rPr/>
+              <w:rPr>
+                <w:b/>
+              </w:rPr>
             </w:r>
           </w:p>
           <w:p>
@@ -564,12 +529,7 @@
             </w:pPr>
             <w:r>
               <w:rPr>
-                <w:rFonts w:eastAsia="Calibri" w:cs="Calibri"/>
-                <w:color w:val="auto"/>
-                <w:kern w:val="0"/>
-                <w:sz w:val="22"/>
-                <w:szCs w:val="22"/>
-                <w:lang w:val="fr-FR" w:eastAsia="fr-FR" w:bidi="ar-SA"/>
+                <w:b/>
               </w:rPr>
             </w:r>
           </w:p>

</xml_diff>

<commit_message>
feat: docx quittance correction (#61)
Co-authored-by: Christian COLEY <christian.coley@smile.com>
</commit_message>
<xml_diff>
--- a/src/assets/docx/Quittance_de_loyer.docx
+++ b/src/assets/docx/Quittance_de_loyer.docx
@@ -110,6 +110,7 @@
             </w:pPr>
             <w:r>
               <w:rPr/>
+              <w:t xml:space="preserve">{nom_bailleur} </w:t>
             </w:r>
           </w:p>
           <w:p>
@@ -120,7 +121,7 @@
             </w:pPr>
             <w:r>
               <w:rPr/>
-              <w:t xml:space="preserve">{nom_bailleur} {prenom_bailleur} </w:t>
+              <w:t>représenté par Sylvain BODIN</w:t>
             </w:r>
           </w:p>
           <w:p>
@@ -184,22 +185,6 @@
               <w:pStyle w:val="Normal"/>
               <w:widowControl w:val="false"/>
               <w:ind w:right="40" w:hanging="0"/>
-              <w:rPr>
-                <w:b/>
-                <w:b/>
-              </w:rPr>
-            </w:pPr>
-            <w:r>
-              <w:rPr>
-                <w:b/>
-              </w:rPr>
-            </w:r>
-          </w:p>
-          <w:p>
-            <w:pPr>
-              <w:pStyle w:val="Normal"/>
-              <w:widowControl w:val="false"/>
-              <w:ind w:right="40" w:hanging="0"/>
               <w:rPr/>
             </w:pPr>
             <w:r>
@@ -232,7 +217,7 @@
             </w:pPr>
             <w:r>
               <w:rPr/>
-              <w:t>{cp_ville_locataire}</w:t>
+              <w:t>69100 Villeurbanne</w:t>
             </w:r>
           </w:p>
         </w:tc>
@@ -268,17 +253,6 @@
       <w:r>
         <w:rPr/>
         <w:t>Fait à {ville_signature}, le {date_now}</w:t>
-      </w:r>
-    </w:p>
-    <w:p>
-      <w:pPr>
-        <w:pStyle w:val="Normal"/>
-        <w:spacing w:lineRule="auto" w:line="240" w:before="0" w:after="0"/>
-        <w:jc w:val="right"/>
-        <w:rPr/>
-      </w:pPr>
-      <w:r>
-        <w:rPr/>
       </w:r>
     </w:p>
     <w:p>
@@ -408,7 +382,7 @@
       </w:pPr>
       <w:r>
         <w:rPr/>
-        <w:t>{cp_ville_location}</w:t>
+        <w:t>69100 Villeurbanne</w:t>
       </w:r>
     </w:p>
     <w:p>
@@ -437,17 +411,6 @@
           <w:bottom w:val="single" w:sz="4" w:space="1" w:color="000000"/>
           <w:right w:val="single" w:sz="4" w:space="4" w:color="000000"/>
         </w:pBdr>
-        <w:spacing w:lineRule="auto" w:line="240" w:before="0" w:after="0"/>
-        <w:jc w:val="both"/>
-        <w:rPr/>
-      </w:pPr>
-      <w:r>
-        <w:rPr/>
-      </w:r>
-    </w:p>
-    <w:p>
-      <w:pPr>
-        <w:pStyle w:val="Normal"/>
         <w:spacing w:lineRule="auto" w:line="240" w:before="0" w:after="0"/>
         <w:jc w:val="both"/>
         <w:rPr/>
@@ -522,7 +485,9 @@
               </w:rPr>
             </w:pPr>
             <w:r>
-              <w:rPr/>
+              <w:rPr>
+                <w:b/>
+              </w:rPr>
             </w:r>
           </w:p>
           <w:p>
@@ -564,12 +529,7 @@
             </w:pPr>
             <w:r>
               <w:rPr>
-                <w:rFonts w:eastAsia="Calibri" w:cs="Calibri"/>
-                <w:color w:val="auto"/>
-                <w:kern w:val="0"/>
-                <w:sz w:val="22"/>
-                <w:szCs w:val="22"/>
-                <w:lang w:val="fr-FR" w:eastAsia="fr-FR" w:bidi="ar-SA"/>
+                <w:b/>
               </w:rPr>
             </w:r>
           </w:p>

</xml_diff>

<commit_message>
fix: quittance orthographe (#63)
Co-authored-by: Christian COLEY <christian.coley@smile.com>
</commit_message>
<xml_diff>
--- a/src/assets/docx/Quittance_de_loyer.docx
+++ b/src/assets/docx/Quittance_de_loyer.docx
@@ -121,7 +121,15 @@
             </w:pPr>
             <w:r>
               <w:rPr/>
-              <w:t>représenté par Sylvain BODIN</w:t>
+              <w:t>représenté</w:t>
+            </w:r>
+            <w:r>
+              <w:rPr/>
+              <w:t>e</w:t>
+            </w:r>
+            <w:r>
+              <w:rPr/>
+              <w:t xml:space="preserve"> par Sylvain BODIN</w:t>
             </w:r>
           </w:p>
           <w:p>

</xml_diff>